<commit_message>
Completar autor Matías Barraza H. en el informe
Co-Authored-By: Claude Opus 4.8 <noreply@anthropic.com>
</commit_message>
<xml_diff>
--- a/Informe_Lab3_Neo4J.docx
+++ b/Informe_Lab3_Neo4J.docx
@@ -59,7 +59,7 @@
           <w:sz w:val="19"/>
           <w:szCs w:val="19"/>
         </w:rPr>
-        <w:t xml:space="preserve">Autores: [Nombre integrante 1] · [Nombre integrante 2] · [Nombre integrante 3]</w:t>
+        <w:t xml:space="preserve">Autores: Matías Barraza H. · [Nombre integrante 2] · [Nombre integrante 3]</w:t>
       </w:r>
     </w:p>
     <w:p>
@@ -73,7 +73,7 @@
           <w:sz w:val="18"/>
           <w:szCs w:val="18"/>
         </w:rPr>
-        <w:t xml:space="preserve">e-mails: [correo1] · [correo2] · [correo3]</w:t>
+        <w:t xml:space="preserve">e-mails: matias.barrazah@usm.cl · [correo2] · [correo3]</w:t>
       </w:r>
     </w:p>
     <w:p>

</xml_diff>

<commit_message>
Completar correos de los 5 integrantes en el informe
Co-Authored-By: Claude Sonnet 5 <noreply@anthropic.com>
</commit_message>
<xml_diff>
--- a/Informe_Lab3_Neo4J.docx
+++ b/Informe_Lab3_Neo4J.docx
@@ -6,14 +6,18 @@
       <w:pPr>
         <w:spacing w:after="40"/>
         <w:jc w:val="center"/>
+        <w:rPr>
+          <w:sz w:val="32"/>
+          <w:szCs w:val="32"/>
+        </w:rPr>
       </w:pPr>
       <w:r>
         <w:rPr>
           <w:b/>
           <w:bCs/>
           <w:color w:val="555555"/>
-          <w:sz w:val="20"/>
-          <w:szCs w:val="20"/>
+          <w:sz w:val="32"/>
+          <w:szCs w:val="32"/>
         </w:rPr>
         <w:t>INF-325 Bases de Datos Avanzadas</w:t>
       </w:r>
@@ -22,8 +26,6 @@
       <w:pPr>
         <w:spacing w:after="60"/>
         <w:jc w:val="center"/>
-      </w:pPr>
-      <w:r>
         <w:rPr>
           <w:b/>
           <w:bCs/>
@@ -31,6 +33,15 @@
           <w:sz w:val="30"/>
           <w:szCs w:val="30"/>
         </w:rPr>
+      </w:pPr>
+      <w:r>
+        <w:rPr>
+          <w:b/>
+          <w:bCs/>
+          <w:color w:val="1F4E79"/>
+          <w:sz w:val="30"/>
+          <w:szCs w:val="30"/>
+        </w:rPr>
         <w:t>Laboratorio 3 — Neo4j</w:t>
       </w:r>
     </w:p>
@@ -38,17 +49,13 @@
       <w:pPr>
         <w:spacing w:after="120"/>
         <w:jc w:val="center"/>
-      </w:pPr>
-      <w:r>
         <w:rPr>
           <w:b/>
           <w:bCs/>
           <w:sz w:val="24"/>
           <w:szCs w:val="24"/>
         </w:rPr>
-        <w:t xml:space="preserve">Grafo de </w:t>
-      </w:r>
-      <w:proofErr w:type="spellStart"/>
+      </w:pPr>
       <w:r>
         <w:rPr>
           <w:b/>
@@ -56,17 +63,7 @@
           <w:sz w:val="24"/>
           <w:szCs w:val="24"/>
         </w:rPr>
-        <w:t>Explicabilidad</w:t>
-      </w:r>
-      <w:proofErr w:type="spellEnd"/>
-      <w:r>
-        <w:rPr>
-          <w:b/>
-          <w:bCs/>
-          <w:sz w:val="24"/>
-          <w:szCs w:val="24"/>
-        </w:rPr>
-        <w:t xml:space="preserve"> para Auditoría de Clasificación Normativa</w:t>
+        <w:t>Grafo de Explicabilidad para Auditoría de Clasificación Normativa</w:t>
       </w:r>
     </w:p>
     <w:p>
@@ -100,57 +97,16 @@
           <w:sz w:val="19"/>
           <w:szCs w:val="19"/>
         </w:rPr>
-        <w:t xml:space="preserve">Matias Lara </w:t>
-      </w:r>
-      <w:r>
-        <w:rPr>
-          <w:sz w:val="19"/>
-          <w:szCs w:val="19"/>
-        </w:rPr>
-        <w:t>·</w:t>
-      </w:r>
-      <w:r>
-        <w:rPr>
-          <w:sz w:val="19"/>
-          <w:szCs w:val="19"/>
-        </w:rPr>
-        <w:t xml:space="preserve"> </w:t>
-      </w:r>
-      <w:proofErr w:type="spellStart"/>
-      <w:r>
-        <w:rPr>
-          <w:sz w:val="19"/>
-          <w:szCs w:val="19"/>
-        </w:rPr>
-        <w:t>Jose</w:t>
-      </w:r>
-      <w:proofErr w:type="spellEnd"/>
-      <w:r>
-        <w:rPr>
-          <w:sz w:val="19"/>
-          <w:szCs w:val="19"/>
-        </w:rPr>
-        <w:t xml:space="preserve"> Meza </w:t>
-      </w:r>
-      <w:r>
-        <w:rPr>
-          <w:sz w:val="19"/>
-          <w:szCs w:val="19"/>
-        </w:rPr>
-        <w:t>·</w:t>
-      </w:r>
-      <w:r>
-        <w:rPr>
-          <w:sz w:val="19"/>
-          <w:szCs w:val="19"/>
-        </w:rPr>
-        <w:t xml:space="preserve"> Javier Hormaechea</w:t>
+        <w:t>Matias Lara · Jose Meza · Javier Hormaechea</w:t>
       </w:r>
     </w:p>
     <w:p>
       <w:pPr>
         <w:spacing w:after="30"/>
         <w:jc w:val="center"/>
+        <w:rPr>
+          <w:lang w:val="en-US"/>
+        </w:rPr>
       </w:pPr>
       <w:r>
         <w:rPr>
@@ -159,8 +115,19 @@
           <w:szCs w:val="18"/>
           <w:lang w:val="en-US"/>
         </w:rPr>
-        <w:t xml:space="preserve">e-mails: matias.barrazah@usm.cl · </w:t>
-      </w:r>
+        <w:t xml:space="preserve">e-mails: </w:t>
+      </w:r>
+      <w:hyperlink r:id="rId7" w:history="1">
+        <w:r>
+          <w:rPr>
+            <w:rStyle w:val="Hipervnculo"/>
+            <w:sz w:val="18"/>
+            <w:szCs w:val="18"/>
+            <w:lang w:val="en-US"/>
+          </w:rPr>
+          <w:t>matias.barrazah@usm.cl</w:t>
+        </w:r>
+      </w:hyperlink>
       <w:r>
         <w:rPr>
           <w:color w:val="555555"/>
@@ -168,7 +135,7 @@
           <w:szCs w:val="18"/>
           <w:lang w:val="en-US"/>
         </w:rPr>
-        <w:t>martin.</w:t>
+        <w:t xml:space="preserve"> </w:t>
       </w:r>
       <w:r>
         <w:rPr>
@@ -177,8 +144,19 @@
           <w:szCs w:val="18"/>
           <w:lang w:val="en-US"/>
         </w:rPr>
-        <w:t>chacon</w:t>
-      </w:r>
+        <w:t xml:space="preserve">· </w:t>
+      </w:r>
+      <w:hyperlink r:id="rId8" w:history="1">
+        <w:r>
+          <w:rPr>
+            <w:rStyle w:val="Hipervnculo"/>
+            <w:sz w:val="18"/>
+            <w:szCs w:val="18"/>
+            <w:lang w:val="en-US"/>
+          </w:rPr>
+          <w:t>martin.chacon@usm.cl</w:t>
+        </w:r>
+      </w:hyperlink>
       <w:r>
         <w:rPr>
           <w:color w:val="555555"/>
@@ -186,7 +164,7 @@
           <w:szCs w:val="18"/>
           <w:lang w:val="en-US"/>
         </w:rPr>
-        <w:t>@</w:t>
+        <w:t xml:space="preserve"> </w:t>
       </w:r>
       <w:r>
         <w:rPr>
@@ -195,8 +173,19 @@
           <w:szCs w:val="18"/>
           <w:lang w:val="en-US"/>
         </w:rPr>
-        <w:t>usm.cl</w:t>
-      </w:r>
+        <w:t xml:space="preserve">· </w:t>
+      </w:r>
+      <w:hyperlink r:id="rId9" w:history="1">
+        <w:r>
+          <w:rPr>
+            <w:rStyle w:val="Hipervnculo"/>
+            <w:sz w:val="18"/>
+            <w:szCs w:val="18"/>
+            <w:lang w:val="en-US"/>
+          </w:rPr>
+          <w:t>jose.mezap@usm.cl</w:t>
+        </w:r>
+      </w:hyperlink>
       <w:r>
         <w:rPr>
           <w:color w:val="555555"/>
@@ -211,34 +200,62 @@
           <w:color w:val="555555"/>
           <w:sz w:val="18"/>
           <w:szCs w:val="18"/>
-        </w:rPr>
-        <w:t>· [correo3]</w:t>
-      </w:r>
-    </w:p>
-    <w:p>
-      <w:pPr>
-        <w:spacing w:after="60"/>
-        <w:jc w:val="center"/>
-      </w:pPr>
+          <w:lang w:val="en-US"/>
+        </w:rPr>
+        <w:t>· matias.larap@usm.cl</w:t>
+      </w:r>
       <w:r>
         <w:rPr>
           <w:color w:val="555555"/>
           <w:sz w:val="18"/>
           <w:szCs w:val="18"/>
-        </w:rPr>
-        <w:t>Profesor: Mauricio Figueroa Colarte</w:t>
-      </w:r>
-    </w:p>
-    <w:p>
-      <w:pPr>
-        <w:spacing w:after="200"/>
-        <w:jc w:val="center"/>
-      </w:pPr>
+          <w:lang w:val="en-US"/>
+        </w:rPr>
+        <w:t xml:space="preserve"> </w:t>
+      </w:r>
       <w:r>
         <w:rPr>
           <w:color w:val="555555"/>
           <w:sz w:val="18"/>
           <w:szCs w:val="18"/>
+          <w:lang w:val="en-US"/>
+        </w:rPr>
+        <w:t>javier.hormaechea@usm.cl</w:t>
+      </w:r>
+      <w:r>
+        <w:rPr>
+          <w:color w:val="555555"/>
+          <w:sz w:val="18"/>
+          <w:szCs w:val="18"/>
+          <w:lang w:val="en-US"/>
+        </w:rPr>
+        <w:t xml:space="preserve">  </w:t>
+      </w:r>
+    </w:p>
+    <w:p>
+      <w:pPr>
+        <w:spacing w:after="60" w:line="360" w:lineRule="auto"/>
+        <w:jc w:val="center"/>
+      </w:pPr>
+      <w:r>
+        <w:rPr>
+          <w:color w:val="555555"/>
+          <w:sz w:val="18"/>
+          <w:szCs w:val="18"/>
+        </w:rPr>
+        <w:t>Profesor: Mauricio Figueroa Colarte</w:t>
+      </w:r>
+    </w:p>
+    <w:p>
+      <w:pPr>
+        <w:spacing w:after="200" w:line="360" w:lineRule="auto"/>
+        <w:jc w:val="center"/>
+      </w:pPr>
+      <w:r>
+        <w:rPr>
+          <w:color w:val="555555"/>
+          <w:sz w:val="18"/>
+          <w:szCs w:val="18"/>
         </w:rPr>
         <w:t>Universidad Técnica Federico Santa María — Departamento de Informática</w:t>
       </w:r>
@@ -397,7 +414,11 @@
         <w:jc w:val="both"/>
       </w:pPr>
       <w:r>
-        <w:t xml:space="preserve">Sin embargo, una decisión automatizada no debe aceptarse sin revisión. El equipo humano de cumplimiento necesita comprender por qué la IA asignó una clasificación, qué evidencia respalda esa decisión y si la explicación entregada es válida para el negocio. El resultado de la IA se encuentra en formato tabular (CSV), lo que permite saber el </w:t>
+        <w:t xml:space="preserve">Sin embargo, una decisión automatizada no debe aceptarse sin revisión. El equipo humano de cumplimiento necesita comprender por qué la IA asignó una clasificación, qué evidencia respalda esa decisión y si la explicación entregada es válida para el negocio. El resultado de la IA se encuentra en </w:t>
+      </w:r>
+      <w:r>
+        <w:lastRenderedPageBreak/>
+        <w:t xml:space="preserve">formato tabular (CSV), lo que permite saber el </w:t>
       </w:r>
       <w:r>
         <w:t>veredicto,</w:t>
@@ -412,7 +433,6 @@
         <w:jc w:val="both"/>
       </w:pPr>
       <w:r>
-        <w:lastRenderedPageBreak/>
         <w:t xml:space="preserve">Este trabajo aborda dicho problema mediante un grafo de </w:t>
       </w:r>
       <w:proofErr w:type="spellStart"/>
@@ -439,11 +459,6 @@
       <w:r>
         <w:t>, falta de evidencia o contradicción entre la clasificación y las reglas de negocio.</w:t>
       </w:r>
-    </w:p>
-    <w:p>
-      <w:pPr>
-        <w:pStyle w:val="Ttulo1"/>
-      </w:pPr>
     </w:p>
     <w:p>
       <w:pPr>
@@ -489,10 +504,7 @@
         <w:pStyle w:val="Ttulo2"/>
       </w:pPr>
       <w:r>
-        <w:t>2.1 Construcción</w:t>
-      </w:r>
-      <w:r>
-        <w:t xml:space="preserve"> del grafo desde el </w:t>
+        <w:t xml:space="preserve">2.1 Construcción del grafo desde el </w:t>
       </w:r>
       <w:proofErr w:type="spellStart"/>
       <w:r>
@@ -577,7 +589,6 @@
         <w:t xml:space="preserve">  FOR (</w:t>
       </w:r>
       <w:proofErr w:type="spellStart"/>
-      <w:proofErr w:type="gramStart"/>
       <w:r>
         <w:rPr>
           <w:rFonts w:ascii="Consolas" w:eastAsia="Consolas" w:hAnsi="Consolas" w:cs="Consolas"/>
@@ -588,7 +599,6 @@
         <w:t>n:Normativa</w:t>
       </w:r>
       <w:proofErr w:type="spellEnd"/>
-      <w:proofErr w:type="gramEnd"/>
       <w:r>
         <w:rPr>
           <w:rFonts w:ascii="Consolas" w:eastAsia="Consolas" w:hAnsi="Consolas" w:cs="Consolas"/>
@@ -811,8 +821,9 @@
           <w:szCs w:val="16"/>
           <w:lang w:val="en-US"/>
         </w:rPr>
-        <w:t>row</w:t>
-      </w:r>
+        <w:t>rowWITH</w:t>
+      </w:r>
+      <w:proofErr w:type="spellEnd"/>
       <w:r>
         <w:rPr>
           <w:rFonts w:ascii="Consolas" w:eastAsia="Consolas" w:hAnsi="Consolas" w:cs="Consolas"/>
@@ -820,17 +831,64 @@
           <w:szCs w:val="16"/>
           <w:lang w:val="en-US"/>
         </w:rPr>
-        <w:t>WITH</w:t>
-      </w:r>
-      <w:proofErr w:type="spellEnd"/>
-      <w:r>
-        <w:rPr>
-          <w:rFonts w:ascii="Consolas" w:eastAsia="Consolas" w:hAnsi="Consolas" w:cs="Consolas"/>
-          <w:sz w:val="16"/>
-          <w:szCs w:val="16"/>
+        <w:t xml:space="preserve"> row WHERE row.name IS NOT NULL AND trim(row.name) &lt;&gt; ''</w:t>
+      </w:r>
+    </w:p>
+    <w:p>
+      <w:pPr>
+        <w:shd w:val="clear" w:color="auto" w:fill="F2F2F2"/>
+        <w:rPr>
           <w:lang w:val="en-US"/>
         </w:rPr>
-        <w:t xml:space="preserve"> row WHERE row.name IS NOT NULL AND trim(row.name) &lt;&gt; ''</w:t>
+      </w:pPr>
+      <w:r>
+        <w:rPr>
+          <w:rFonts w:ascii="Consolas" w:eastAsia="Consolas" w:hAnsi="Consolas" w:cs="Consolas"/>
+          <w:sz w:val="16"/>
+          <w:szCs w:val="16"/>
+          <w:lang w:val="en-US"/>
+        </w:rPr>
+        <w:t>MERGE (</w:t>
+      </w:r>
+      <w:proofErr w:type="spellStart"/>
+      <w:r>
+        <w:rPr>
+          <w:rFonts w:ascii="Consolas" w:eastAsia="Consolas" w:hAnsi="Consolas" w:cs="Consolas"/>
+          <w:sz w:val="16"/>
+          <w:szCs w:val="16"/>
+          <w:lang w:val="en-US"/>
+        </w:rPr>
+        <w:t>n:Normativa</w:t>
+      </w:r>
+      <w:proofErr w:type="spellEnd"/>
+      <w:r>
+        <w:rPr>
+          <w:rFonts w:ascii="Consolas" w:eastAsia="Consolas" w:hAnsi="Consolas" w:cs="Consolas"/>
+          <w:sz w:val="16"/>
+          <w:szCs w:val="16"/>
+          <w:lang w:val="en-US"/>
+        </w:rPr>
+        <w:t xml:space="preserve"> {name: trim(</w:t>
+      </w:r>
+      <w:proofErr w:type="gramStart"/>
+      <w:r>
+        <w:rPr>
+          <w:rFonts w:ascii="Consolas" w:eastAsia="Consolas" w:hAnsi="Consolas" w:cs="Consolas"/>
+          <w:sz w:val="16"/>
+          <w:szCs w:val="16"/>
+          <w:lang w:val="en-US"/>
+        </w:rPr>
+        <w:t>row.name)}</w:t>
+      </w:r>
+      <w:proofErr w:type="gramEnd"/>
+      <w:r>
+        <w:rPr>
+          <w:rFonts w:ascii="Consolas" w:eastAsia="Consolas" w:hAnsi="Consolas" w:cs="Consolas"/>
+          <w:sz w:val="16"/>
+          <w:szCs w:val="16"/>
+          <w:lang w:val="en-US"/>
+        </w:rPr>
+        <w:t>)</w:t>
       </w:r>
     </w:p>
     <w:p>
@@ -847,10 +905,9 @@
           <w:szCs w:val="16"/>
           <w:lang w:val="en-US"/>
         </w:rPr>
-        <w:t>MERGE (</w:t>
-      </w:r>
-      <w:proofErr w:type="spellStart"/>
-      <w:proofErr w:type="gramStart"/>
+        <w:t xml:space="preserve">  SET </w:t>
+      </w:r>
+      <w:proofErr w:type="spellStart"/>
       <w:r>
         <w:rPr>
           <w:rFonts w:ascii="Consolas" w:eastAsia="Consolas" w:hAnsi="Consolas" w:cs="Consolas"/>
@@ -858,10 +915,9 @@
           <w:szCs w:val="16"/>
           <w:lang w:val="en-US"/>
         </w:rPr>
-        <w:t>n:Normativa</w:t>
-      </w:r>
-      <w:proofErr w:type="spellEnd"/>
-      <w:proofErr w:type="gramEnd"/>
+        <w:t>n.description</w:t>
+      </w:r>
+      <w:proofErr w:type="spellEnd"/>
       <w:r>
         <w:rPr>
           <w:rFonts w:ascii="Consolas" w:eastAsia="Consolas" w:hAnsi="Consolas" w:cs="Consolas"/>
@@ -869,9 +925,9 @@
           <w:szCs w:val="16"/>
           <w:lang w:val="en-US"/>
         </w:rPr>
-        <w:t xml:space="preserve"> {name: trim(</w:t>
-      </w:r>
-      <w:proofErr w:type="gramStart"/>
+        <w:t>=</w:t>
+      </w:r>
+      <w:proofErr w:type="spellStart"/>
       <w:r>
         <w:rPr>
           <w:rFonts w:ascii="Consolas" w:eastAsia="Consolas" w:hAnsi="Consolas" w:cs="Consolas"/>
@@ -879,70 +935,9 @@
           <w:szCs w:val="16"/>
           <w:lang w:val="en-US"/>
         </w:rPr>
-        <w:t>row.name)}</w:t>
-      </w:r>
-      <w:proofErr w:type="gramEnd"/>
-      <w:r>
-        <w:rPr>
-          <w:rFonts w:ascii="Consolas" w:eastAsia="Consolas" w:hAnsi="Consolas" w:cs="Consolas"/>
-          <w:sz w:val="16"/>
-          <w:szCs w:val="16"/>
-          <w:lang w:val="en-US"/>
-        </w:rPr>
-        <w:t>)</w:t>
-      </w:r>
-    </w:p>
-    <w:p>
-      <w:pPr>
-        <w:shd w:val="clear" w:color="auto" w:fill="F2F2F2"/>
-        <w:rPr>
-          <w:lang w:val="en-US"/>
-        </w:rPr>
-      </w:pPr>
-      <w:r>
-        <w:rPr>
-          <w:rFonts w:ascii="Consolas" w:eastAsia="Consolas" w:hAnsi="Consolas" w:cs="Consolas"/>
-          <w:sz w:val="16"/>
-          <w:szCs w:val="16"/>
-          <w:lang w:val="en-US"/>
-        </w:rPr>
-        <w:t xml:space="preserve">  SET </w:t>
-      </w:r>
-      <w:proofErr w:type="spellStart"/>
-      <w:proofErr w:type="gramStart"/>
-      <w:r>
-        <w:rPr>
-          <w:rFonts w:ascii="Consolas" w:eastAsia="Consolas" w:hAnsi="Consolas" w:cs="Consolas"/>
-          <w:sz w:val="16"/>
-          <w:szCs w:val="16"/>
-          <w:lang w:val="en-US"/>
-        </w:rPr>
-        <w:t>n.description</w:t>
-      </w:r>
-      <w:proofErr w:type="spellEnd"/>
-      <w:proofErr w:type="gramEnd"/>
-      <w:r>
-        <w:rPr>
-          <w:rFonts w:ascii="Consolas" w:eastAsia="Consolas" w:hAnsi="Consolas" w:cs="Consolas"/>
-          <w:sz w:val="16"/>
-          <w:szCs w:val="16"/>
-          <w:lang w:val="en-US"/>
-        </w:rPr>
-        <w:t>=</w:t>
-      </w:r>
-      <w:proofErr w:type="spellStart"/>
-      <w:proofErr w:type="gramStart"/>
-      <w:r>
-        <w:rPr>
-          <w:rFonts w:ascii="Consolas" w:eastAsia="Consolas" w:hAnsi="Consolas" w:cs="Consolas"/>
-          <w:sz w:val="16"/>
-          <w:szCs w:val="16"/>
-          <w:lang w:val="en-US"/>
-        </w:rPr>
         <w:t>row.description</w:t>
       </w:r>
       <w:proofErr w:type="spellEnd"/>
-      <w:proofErr w:type="gramEnd"/>
       <w:r>
         <w:rPr>
           <w:rFonts w:ascii="Consolas" w:eastAsia="Consolas" w:hAnsi="Consolas" w:cs="Consolas"/>
@@ -1639,12 +1634,6 @@
         <w:gridCol w:w="2600"/>
       </w:tblGrid>
       <w:tr>
-        <w:tblPrEx>
-          <w:tblCellMar>
-            <w:top w:w="0" w:type="dxa"/>
-            <w:bottom w:w="0" w:type="dxa"/>
-          </w:tblCellMar>
-        </w:tblPrEx>
         <w:trPr>
           <w:tblHeader/>
         </w:trPr>
@@ -1743,12 +1732,6 @@
         </w:tc>
       </w:tr>
       <w:tr>
-        <w:tblPrEx>
-          <w:tblCellMar>
-            <w:top w:w="0" w:type="dxa"/>
-            <w:bottom w:w="0" w:type="dxa"/>
-          </w:tblCellMar>
-        </w:tblPrEx>
         <w:tc>
           <w:tcPr>
             <w:tcW w:w="2400" w:type="dxa"/>
@@ -1840,12 +1823,6 @@
         </w:tc>
       </w:tr>
       <w:tr>
-        <w:tblPrEx>
-          <w:tblCellMar>
-            <w:top w:w="0" w:type="dxa"/>
-            <w:bottom w:w="0" w:type="dxa"/>
-          </w:tblCellMar>
-        </w:tblPrEx>
         <w:tc>
           <w:tcPr>
             <w:tcW w:w="2400" w:type="dxa"/>
@@ -1947,12 +1924,6 @@
         </w:tc>
       </w:tr>
       <w:tr>
-        <w:tblPrEx>
-          <w:tblCellMar>
-            <w:top w:w="0" w:type="dxa"/>
-            <w:bottom w:w="0" w:type="dxa"/>
-          </w:tblCellMar>
-        </w:tblPrEx>
         <w:tc>
           <w:tcPr>
             <w:tcW w:w="2400" w:type="dxa"/>
@@ -2054,12 +2025,6 @@
         </w:tc>
       </w:tr>
       <w:tr>
-        <w:tblPrEx>
-          <w:tblCellMar>
-            <w:top w:w="0" w:type="dxa"/>
-            <w:bottom w:w="0" w:type="dxa"/>
-          </w:tblCellMar>
-        </w:tblPrEx>
         <w:tc>
           <w:tcPr>
             <w:tcW w:w="2400" w:type="dxa"/>
@@ -2161,12 +2126,6 @@
         </w:tc>
       </w:tr>
       <w:tr>
-        <w:tblPrEx>
-          <w:tblCellMar>
-            <w:top w:w="0" w:type="dxa"/>
-            <w:bottom w:w="0" w:type="dxa"/>
-          </w:tblCellMar>
-        </w:tblPrEx>
         <w:tc>
           <w:tcPr>
             <w:tcW w:w="2400" w:type="dxa"/>
@@ -2258,12 +2217,6 @@
         </w:tc>
       </w:tr>
       <w:tr>
-        <w:tblPrEx>
-          <w:tblCellMar>
-            <w:top w:w="0" w:type="dxa"/>
-            <w:bottom w:w="0" w:type="dxa"/>
-          </w:tblCellMar>
-        </w:tblPrEx>
         <w:tc>
           <w:tcPr>
             <w:tcW w:w="2400" w:type="dxa"/>
@@ -2365,12 +2318,6 @@
         </w:tc>
       </w:tr>
       <w:tr>
-        <w:tblPrEx>
-          <w:tblCellMar>
-            <w:top w:w="0" w:type="dxa"/>
-            <w:bottom w:w="0" w:type="dxa"/>
-          </w:tblCellMar>
-        </w:tblPrEx>
         <w:tc>
           <w:tcPr>
             <w:tcW w:w="2400" w:type="dxa"/>
@@ -2472,12 +2419,6 @@
         </w:tc>
       </w:tr>
       <w:tr>
-        <w:tblPrEx>
-          <w:tblCellMar>
-            <w:top w:w="0" w:type="dxa"/>
-            <w:bottom w:w="0" w:type="dxa"/>
-          </w:tblCellMar>
-        </w:tblPrEx>
         <w:tc>
           <w:tcPr>
             <w:tcW w:w="2400" w:type="dxa"/>
@@ -2579,12 +2520,6 @@
         </w:tc>
       </w:tr>
       <w:tr>
-        <w:tblPrEx>
-          <w:tblCellMar>
-            <w:top w:w="0" w:type="dxa"/>
-            <w:bottom w:w="0" w:type="dxa"/>
-          </w:tblCellMar>
-        </w:tblPrEx>
         <w:tc>
           <w:tcPr>
             <w:tcW w:w="2400" w:type="dxa"/>
@@ -2737,12 +2672,6 @@
         <w:gridCol w:w="5960"/>
       </w:tblGrid>
       <w:tr>
-        <w:tblPrEx>
-          <w:tblCellMar>
-            <w:top w:w="0" w:type="dxa"/>
-            <w:bottom w:w="0" w:type="dxa"/>
-          </w:tblCellMar>
-        </w:tblPrEx>
         <w:trPr>
           <w:tblHeader/>
         </w:trPr>
@@ -2810,12 +2739,6 @@
         </w:tc>
       </w:tr>
       <w:tr>
-        <w:tblPrEx>
-          <w:tblCellMar>
-            <w:top w:w="0" w:type="dxa"/>
-            <w:bottom w:w="0" w:type="dxa"/>
-          </w:tblCellMar>
-        </w:tblPrEx>
         <w:tc>
           <w:tcPr>
             <w:tcW w:w="3400" w:type="dxa"/>
@@ -2932,12 +2855,6 @@
         </w:tc>
       </w:tr>
       <w:tr>
-        <w:tblPrEx>
-          <w:tblCellMar>
-            <w:top w:w="0" w:type="dxa"/>
-            <w:bottom w:w="0" w:type="dxa"/>
-          </w:tblCellMar>
-        </w:tblPrEx>
         <w:tc>
           <w:tcPr>
             <w:tcW w:w="3400" w:type="dxa"/>
@@ -3064,12 +2981,6 @@
         </w:tc>
       </w:tr>
       <w:tr>
-        <w:tblPrEx>
-          <w:tblCellMar>
-            <w:top w:w="0" w:type="dxa"/>
-            <w:bottom w:w="0" w:type="dxa"/>
-          </w:tblCellMar>
-        </w:tblPrEx>
         <w:tc>
           <w:tcPr>
             <w:tcW w:w="3400" w:type="dxa"/>
@@ -3186,12 +3097,6 @@
         </w:tc>
       </w:tr>
       <w:tr>
-        <w:tblPrEx>
-          <w:tblCellMar>
-            <w:top w:w="0" w:type="dxa"/>
-            <w:bottom w:w="0" w:type="dxa"/>
-          </w:tblCellMar>
-        </w:tblPrEx>
         <w:tc>
           <w:tcPr>
             <w:tcW w:w="3400" w:type="dxa"/>
@@ -3318,12 +3223,6 @@
         </w:tc>
       </w:tr>
       <w:tr>
-        <w:tblPrEx>
-          <w:tblCellMar>
-            <w:top w:w="0" w:type="dxa"/>
-            <w:bottom w:w="0" w:type="dxa"/>
-          </w:tblCellMar>
-        </w:tblPrEx>
         <w:tc>
           <w:tcPr>
             <w:tcW w:w="3400" w:type="dxa"/>
@@ -3440,12 +3339,6 @@
         </w:tc>
       </w:tr>
       <w:tr>
-        <w:tblPrEx>
-          <w:tblCellMar>
-            <w:top w:w="0" w:type="dxa"/>
-            <w:bottom w:w="0" w:type="dxa"/>
-          </w:tblCellMar>
-        </w:tblPrEx>
         <w:tc>
           <w:tcPr>
             <w:tcW w:w="3400" w:type="dxa"/>
@@ -3552,12 +3445,6 @@
         </w:tc>
       </w:tr>
       <w:tr>
-        <w:tblPrEx>
-          <w:tblCellMar>
-            <w:top w:w="0" w:type="dxa"/>
-            <w:bottom w:w="0" w:type="dxa"/>
-          </w:tblCellMar>
-        </w:tblPrEx>
         <w:tc>
           <w:tcPr>
             <w:tcW w:w="3400" w:type="dxa"/>
@@ -3656,12 +3543,6 @@
         </w:tc>
       </w:tr>
       <w:tr>
-        <w:tblPrEx>
-          <w:tblCellMar>
-            <w:top w:w="0" w:type="dxa"/>
-            <w:bottom w:w="0" w:type="dxa"/>
-          </w:tblCellMar>
-        </w:tblPrEx>
         <w:tc>
           <w:tcPr>
             <w:tcW w:w="3400" w:type="dxa"/>
@@ -3778,12 +3659,6 @@
         </w:tc>
       </w:tr>
       <w:tr>
-        <w:tblPrEx>
-          <w:tblCellMar>
-            <w:top w:w="0" w:type="dxa"/>
-            <w:bottom w:w="0" w:type="dxa"/>
-          </w:tblCellMar>
-        </w:tblPrEx>
         <w:tc>
           <w:tcPr>
             <w:tcW w:w="3400" w:type="dxa"/>
@@ -3900,12 +3775,6 @@
         </w:tc>
       </w:tr>
       <w:tr>
-        <w:tblPrEx>
-          <w:tblCellMar>
-            <w:top w:w="0" w:type="dxa"/>
-            <w:bottom w:w="0" w:type="dxa"/>
-          </w:tblCellMar>
-        </w:tblPrEx>
         <w:tc>
           <w:tcPr>
             <w:tcW w:w="3400" w:type="dxa"/>
@@ -4033,12 +3902,6 @@
         </w:tc>
       </w:tr>
       <w:tr>
-        <w:tblPrEx>
-          <w:tblCellMar>
-            <w:top w:w="0" w:type="dxa"/>
-            <w:bottom w:w="0" w:type="dxa"/>
-          </w:tblCellMar>
-        </w:tblPrEx>
         <w:tc>
           <w:tcPr>
             <w:tcW w:w="3400" w:type="dxa"/>
@@ -4176,12 +4039,10 @@
         <w:t>Este diseño satisface la ruta conceptual esperada Normativa → Clasificación IA → Explicación IA → Regla de negocio → Evidencia textual → Auditoría humana, manteniendo a la Normativa como nodo central (</w:t>
       </w:r>
       <w:proofErr w:type="spellStart"/>
-      <w:proofErr w:type="gramStart"/>
       <w:r>
         <w:t>hub</w:t>
       </w:r>
       <w:proofErr w:type="spellEnd"/>
-      <w:proofErr w:type="gramEnd"/>
       <w:r>
         <w:t>) tal como muestra la Figura 1 del enunciado.</w:t>
       </w:r>
@@ -4213,12 +4074,6 @@
         <w:gridCol w:w="9600"/>
       </w:tblGrid>
       <w:tr>
-        <w:tblPrEx>
-          <w:tblCellMar>
-            <w:top w:w="0" w:type="dxa"/>
-            <w:bottom w:w="0" w:type="dxa"/>
-          </w:tblCellMar>
-        </w:tblPrEx>
         <w:tc>
           <w:tcPr>
             <w:tcW w:w="9360" w:type="dxa"/>
@@ -4267,7 +4122,7 @@
                           </pic:cNvPicPr>
                         </pic:nvPicPr>
                         <pic:blipFill>
-                          <a:blip r:embed="rId7">
+                          <a:blip r:embed="rId10">
                             <a:extLst>
                               <a:ext uri="{28A0092B-C50C-407E-A947-70E740481C1C}">
                                 <a14:useLocalDpi xmlns:a14="http://schemas.microsoft.com/office/drawing/2010/main" val="0"/>
@@ -4346,10 +4201,7 @@
         <w:pStyle w:val="Ttulo2"/>
       </w:pPr>
       <w:r>
-        <w:t>2.2 Representación</w:t>
-      </w:r>
-      <w:r>
-        <w:t xml:space="preserve"> de clasificación, explicación y evidencia</w:t>
+        <w:t>2.2 Representación de clasificación, explicación y evidencia</w:t>
       </w:r>
     </w:p>
     <w:p>
@@ -4432,12 +4284,6 @@
         <w:gridCol w:w="3120"/>
       </w:tblGrid>
       <w:tr>
-        <w:tblPrEx>
-          <w:tblCellMar>
-            <w:top w:w="0" w:type="dxa"/>
-            <w:bottom w:w="0" w:type="dxa"/>
-          </w:tblCellMar>
-        </w:tblPrEx>
         <w:trPr>
           <w:tblHeader/>
         </w:trPr>
@@ -4536,12 +4382,6 @@
         </w:tc>
       </w:tr>
       <w:tr>
-        <w:tblPrEx>
-          <w:tblCellMar>
-            <w:top w:w="0" w:type="dxa"/>
-            <w:bottom w:w="0" w:type="dxa"/>
-          </w:tblCellMar>
-        </w:tblPrEx>
         <w:tc>
           <w:tcPr>
             <w:tcW w:w="3120" w:type="dxa"/>
@@ -4631,12 +4471,6 @@
         </w:tc>
       </w:tr>
       <w:tr>
-        <w:tblPrEx>
-          <w:tblCellMar>
-            <w:top w:w="0" w:type="dxa"/>
-            <w:bottom w:w="0" w:type="dxa"/>
-          </w:tblCellMar>
-        </w:tblPrEx>
         <w:tc>
           <w:tcPr>
             <w:tcW w:w="3120" w:type="dxa"/>
@@ -4726,12 +4560,6 @@
         </w:tc>
       </w:tr>
       <w:tr>
-        <w:tblPrEx>
-          <w:tblCellMar>
-            <w:top w:w="0" w:type="dxa"/>
-            <w:bottom w:w="0" w:type="dxa"/>
-          </w:tblCellMar>
-        </w:tblPrEx>
         <w:tc>
           <w:tcPr>
             <w:tcW w:w="3120" w:type="dxa"/>
@@ -4821,12 +4649,6 @@
         </w:tc>
       </w:tr>
       <w:tr>
-        <w:tblPrEx>
-          <w:tblCellMar>
-            <w:top w:w="0" w:type="dxa"/>
-            <w:bottom w:w="0" w:type="dxa"/>
-          </w:tblCellMar>
-        </w:tblPrEx>
         <w:tc>
           <w:tcPr>
             <w:tcW w:w="3120" w:type="dxa"/>
@@ -4917,12 +4739,6 @@
         </w:tc>
       </w:tr>
       <w:tr>
-        <w:tblPrEx>
-          <w:tblCellMar>
-            <w:top w:w="0" w:type="dxa"/>
-            <w:bottom w:w="0" w:type="dxa"/>
-          </w:tblCellMar>
-        </w:tblPrEx>
         <w:tc>
           <w:tcPr>
             <w:tcW w:w="3120" w:type="dxa"/>
@@ -5012,12 +4828,6 @@
         </w:tc>
       </w:tr>
       <w:tr>
-        <w:tblPrEx>
-          <w:tblCellMar>
-            <w:top w:w="0" w:type="dxa"/>
-            <w:bottom w:w="0" w:type="dxa"/>
-          </w:tblCellMar>
-        </w:tblPrEx>
         <w:tc>
           <w:tcPr>
             <w:tcW w:w="3120" w:type="dxa"/>
@@ -5155,12 +4965,6 @@
         <w:gridCol w:w="9600"/>
       </w:tblGrid>
       <w:tr>
-        <w:tblPrEx>
-          <w:tblCellMar>
-            <w:top w:w="0" w:type="dxa"/>
-            <w:bottom w:w="0" w:type="dxa"/>
-          </w:tblCellMar>
-        </w:tblPrEx>
         <w:tc>
           <w:tcPr>
             <w:tcW w:w="9360" w:type="dxa"/>
@@ -5209,7 +5013,7 @@
                           </pic:cNvPicPr>
                         </pic:nvPicPr>
                         <pic:blipFill>
-                          <a:blip r:embed="rId8">
+                          <a:blip r:embed="rId11">
                             <a:extLst>
                               <a:ext uri="{28A0092B-C50C-407E-A947-70E740481C1C}">
                                 <a14:useLocalDpi xmlns:a14="http://schemas.microsoft.com/office/drawing/2010/main" val="0"/>
@@ -5639,7 +5443,6 @@
         <w:t xml:space="preserve">, </w:t>
       </w:r>
       <w:proofErr w:type="spellStart"/>
-      <w:proofErr w:type="gramStart"/>
       <w:r>
         <w:rPr>
           <w:rFonts w:ascii="Consolas" w:eastAsia="Consolas" w:hAnsi="Consolas" w:cs="Consolas"/>
@@ -5657,9 +5460,126 @@
           <w:szCs w:val="16"/>
           <w:lang w:val="en-US"/>
         </w:rPr>
+        <w:t>(n.name+' '+</w:t>
+      </w:r>
+      <w:proofErr w:type="spellStart"/>
+      <w:r>
+        <w:rPr>
+          <w:rFonts w:ascii="Consolas" w:eastAsia="Consolas" w:hAnsi="Consolas" w:cs="Consolas"/>
+          <w:sz w:val="16"/>
+          <w:szCs w:val="16"/>
+          <w:lang w:val="en-US"/>
+        </w:rPr>
+        <w:t>n.description</w:t>
+      </w:r>
+      <w:proofErr w:type="spellEnd"/>
+      <w:r>
+        <w:rPr>
+          <w:rFonts w:ascii="Consolas" w:eastAsia="Consolas" w:hAnsi="Consolas" w:cs="Consolas"/>
+          <w:sz w:val="16"/>
+          <w:szCs w:val="16"/>
+          <w:lang w:val="en-US"/>
+        </w:rPr>
+        <w:t>+' '+</w:t>
+      </w:r>
+      <w:proofErr w:type="spellStart"/>
+      <w:r>
+        <w:rPr>
+          <w:rFonts w:ascii="Consolas" w:eastAsia="Consolas" w:hAnsi="Consolas" w:cs="Consolas"/>
+          <w:sz w:val="16"/>
+          <w:szCs w:val="16"/>
+          <w:lang w:val="en-US"/>
+        </w:rPr>
+        <w:t>n.cuerpo</w:t>
+      </w:r>
+      <w:proofErr w:type="spellEnd"/>
+      <w:r>
+        <w:rPr>
+          <w:rFonts w:ascii="Consolas" w:eastAsia="Consolas" w:hAnsi="Consolas" w:cs="Consolas"/>
+          <w:sz w:val="16"/>
+          <w:szCs w:val="16"/>
+          <w:lang w:val="en-US"/>
+        </w:rPr>
+        <w:t>+' '+</w:t>
+      </w:r>
+      <w:proofErr w:type="spellStart"/>
+      <w:r>
+        <w:rPr>
+          <w:rFonts w:ascii="Consolas" w:eastAsia="Consolas" w:hAnsi="Consolas" w:cs="Consolas"/>
+          <w:sz w:val="16"/>
+          <w:szCs w:val="16"/>
+          <w:lang w:val="en-US"/>
+        </w:rPr>
+        <w:t>n.explicacion</w:t>
+      </w:r>
+      <w:proofErr w:type="spellEnd"/>
+      <w:r>
+        <w:rPr>
+          <w:rFonts w:ascii="Consolas" w:eastAsia="Consolas" w:hAnsi="Consolas" w:cs="Consolas"/>
+          <w:sz w:val="16"/>
+          <w:szCs w:val="16"/>
+          <w:lang w:val="en-US"/>
+        </w:rPr>
+        <w:t>) AS blob</w:t>
+      </w:r>
+    </w:p>
+    <w:p>
+      <w:pPr>
+        <w:shd w:val="clear" w:color="auto" w:fill="F2F2F2"/>
+        <w:rPr>
+          <w:lang w:val="en-US"/>
+        </w:rPr>
+      </w:pPr>
+      <w:r>
+        <w:rPr>
+          <w:rFonts w:ascii="Consolas" w:eastAsia="Consolas" w:hAnsi="Consolas" w:cs="Consolas"/>
+          <w:sz w:val="16"/>
+          <w:szCs w:val="16"/>
+          <w:lang w:val="en-US"/>
+        </w:rPr>
+        <w:t>WHERE (</w:t>
+      </w:r>
+      <w:proofErr w:type="spellStart"/>
+      <w:r>
+        <w:rPr>
+          <w:rFonts w:ascii="Consolas" w:eastAsia="Consolas" w:hAnsi="Consolas" w:cs="Consolas"/>
+          <w:sz w:val="16"/>
+          <w:szCs w:val="16"/>
+          <w:lang w:val="en-US"/>
+        </w:rPr>
+        <w:t>rn.modo</w:t>
+      </w:r>
+      <w:proofErr w:type="spellEnd"/>
+      <w:r>
+        <w:rPr>
+          <w:rFonts w:ascii="Consolas" w:eastAsia="Consolas" w:hAnsi="Consolas" w:cs="Consolas"/>
+          <w:sz w:val="16"/>
+          <w:szCs w:val="16"/>
+          <w:lang w:val="en-US"/>
+        </w:rPr>
+        <w:t xml:space="preserve">='contains' AND blob CONTAINS </w:t>
+      </w:r>
+      <w:proofErr w:type="spellStart"/>
+      <w:r>
+        <w:rPr>
+          <w:rFonts w:ascii="Consolas" w:eastAsia="Consolas" w:hAnsi="Consolas" w:cs="Consolas"/>
+          <w:sz w:val="16"/>
+          <w:szCs w:val="16"/>
+          <w:lang w:val="en-US"/>
+        </w:rPr>
+        <w:t>toLower</w:t>
+      </w:r>
+      <w:proofErr w:type="spellEnd"/>
+      <w:r>
+        <w:rPr>
+          <w:rFonts w:ascii="Consolas" w:eastAsia="Consolas" w:hAnsi="Consolas" w:cs="Consolas"/>
+          <w:sz w:val="16"/>
+          <w:szCs w:val="16"/>
+          <w:lang w:val="en-US"/>
+        </w:rPr>
         <w:t>(</w:t>
       </w:r>
-      <w:proofErr w:type="gramEnd"/>
+      <w:proofErr w:type="spellStart"/>
       <w:r>
         <w:rPr>
           <w:rFonts w:ascii="Consolas" w:eastAsia="Consolas" w:hAnsi="Consolas" w:cs="Consolas"/>
@@ -5667,10 +5587,9 @@
           <w:szCs w:val="16"/>
           <w:lang w:val="en-US"/>
         </w:rPr>
-        <w:t>n.name+' '+</w:t>
-      </w:r>
-      <w:proofErr w:type="spellStart"/>
-      <w:proofErr w:type="gramStart"/>
+        <w:t>rn.patron</w:t>
+      </w:r>
+      <w:proofErr w:type="spellEnd"/>
       <w:r>
         <w:rPr>
           <w:rFonts w:ascii="Consolas" w:eastAsia="Consolas" w:hAnsi="Consolas" w:cs="Consolas"/>
@@ -5678,21 +5597,16 @@
           <w:szCs w:val="16"/>
           <w:lang w:val="en-US"/>
         </w:rPr>
-        <w:t>n.description</w:t>
-      </w:r>
-      <w:proofErr w:type="spellEnd"/>
-      <w:proofErr w:type="gramEnd"/>
-      <w:r>
-        <w:rPr>
-          <w:rFonts w:ascii="Consolas" w:eastAsia="Consolas" w:hAnsi="Consolas" w:cs="Consolas"/>
-          <w:sz w:val="16"/>
-          <w:szCs w:val="16"/>
+        <w:t>))</w:t>
+      </w:r>
+    </w:p>
+    <w:p>
+      <w:pPr>
+        <w:shd w:val="clear" w:color="auto" w:fill="F2F2F2"/>
+        <w:rPr>
           <w:lang w:val="en-US"/>
         </w:rPr>
-        <w:t>+' '+</w:t>
-      </w:r>
-      <w:proofErr w:type="spellStart"/>
-      <w:proofErr w:type="gramStart"/>
+      </w:pPr>
       <w:r>
         <w:rPr>
           <w:rFonts w:ascii="Consolas" w:eastAsia="Consolas" w:hAnsi="Consolas" w:cs="Consolas"/>
@@ -5700,10 +5614,9 @@
           <w:szCs w:val="16"/>
           <w:lang w:val="en-US"/>
         </w:rPr>
-        <w:t>n.cuerpo</w:t>
-      </w:r>
-      <w:proofErr w:type="spellEnd"/>
-      <w:proofErr w:type="gramEnd"/>
+        <w:t xml:space="preserve">   OR (</w:t>
+      </w:r>
+      <w:proofErr w:type="spellStart"/>
       <w:r>
         <w:rPr>
           <w:rFonts w:ascii="Consolas" w:eastAsia="Consolas" w:hAnsi="Consolas" w:cs="Consolas"/>
@@ -5711,10 +5624,9 @@
           <w:szCs w:val="16"/>
           <w:lang w:val="en-US"/>
         </w:rPr>
-        <w:t>+' '+</w:t>
-      </w:r>
-      <w:proofErr w:type="spellStart"/>
-      <w:proofErr w:type="gramStart"/>
+        <w:t>rn.modo</w:t>
+      </w:r>
+      <w:proofErr w:type="spellEnd"/>
       <w:r>
         <w:rPr>
           <w:rFonts w:ascii="Consolas" w:eastAsia="Consolas" w:hAnsi="Consolas" w:cs="Consolas"/>
@@ -5722,10 +5634,9 @@
           <w:szCs w:val="16"/>
           <w:lang w:val="en-US"/>
         </w:rPr>
-        <w:t>n.explicacion</w:t>
-      </w:r>
-      <w:proofErr w:type="spellEnd"/>
-      <w:proofErr w:type="gramEnd"/>
+        <w:t xml:space="preserve">='regex'    AND blob =~ </w:t>
+      </w:r>
+      <w:proofErr w:type="spellStart"/>
       <w:r>
         <w:rPr>
           <w:rFonts w:ascii="Consolas" w:eastAsia="Consolas" w:hAnsi="Consolas" w:cs="Consolas"/>
@@ -5733,141 +5644,9 @@
           <w:szCs w:val="16"/>
           <w:lang w:val="en-US"/>
         </w:rPr>
-        <w:t>) AS blob</w:t>
-      </w:r>
-    </w:p>
-    <w:p>
-      <w:pPr>
-        <w:shd w:val="clear" w:color="auto" w:fill="F2F2F2"/>
-        <w:rPr>
-          <w:lang w:val="en-US"/>
-        </w:rPr>
-      </w:pPr>
-      <w:r>
-        <w:rPr>
-          <w:rFonts w:ascii="Consolas" w:eastAsia="Consolas" w:hAnsi="Consolas" w:cs="Consolas"/>
-          <w:sz w:val="16"/>
-          <w:szCs w:val="16"/>
-          <w:lang w:val="en-US"/>
-        </w:rPr>
-        <w:t>WHERE (</w:t>
-      </w:r>
-      <w:proofErr w:type="spellStart"/>
-      <w:proofErr w:type="gramStart"/>
-      <w:r>
-        <w:rPr>
-          <w:rFonts w:ascii="Consolas" w:eastAsia="Consolas" w:hAnsi="Consolas" w:cs="Consolas"/>
-          <w:sz w:val="16"/>
-          <w:szCs w:val="16"/>
-          <w:lang w:val="en-US"/>
-        </w:rPr>
-        <w:t>rn.modo</w:t>
-      </w:r>
-      <w:proofErr w:type="spellEnd"/>
-      <w:proofErr w:type="gramEnd"/>
-      <w:r>
-        <w:rPr>
-          <w:rFonts w:ascii="Consolas" w:eastAsia="Consolas" w:hAnsi="Consolas" w:cs="Consolas"/>
-          <w:sz w:val="16"/>
-          <w:szCs w:val="16"/>
-          <w:lang w:val="en-US"/>
-        </w:rPr>
-        <w:t xml:space="preserve">='contains' AND blob CONTAINS </w:t>
-      </w:r>
-      <w:proofErr w:type="spellStart"/>
-      <w:r>
-        <w:rPr>
-          <w:rFonts w:ascii="Consolas" w:eastAsia="Consolas" w:hAnsi="Consolas" w:cs="Consolas"/>
-          <w:sz w:val="16"/>
-          <w:szCs w:val="16"/>
-          <w:lang w:val="en-US"/>
-        </w:rPr>
-        <w:t>toLower</w:t>
-      </w:r>
-      <w:proofErr w:type="spellEnd"/>
-      <w:r>
-        <w:rPr>
-          <w:rFonts w:ascii="Consolas" w:eastAsia="Consolas" w:hAnsi="Consolas" w:cs="Consolas"/>
-          <w:sz w:val="16"/>
-          <w:szCs w:val="16"/>
-          <w:lang w:val="en-US"/>
-        </w:rPr>
-        <w:t>(</w:t>
-      </w:r>
-      <w:proofErr w:type="spellStart"/>
-      <w:proofErr w:type="gramStart"/>
-      <w:r>
-        <w:rPr>
-          <w:rFonts w:ascii="Consolas" w:eastAsia="Consolas" w:hAnsi="Consolas" w:cs="Consolas"/>
-          <w:sz w:val="16"/>
-          <w:szCs w:val="16"/>
-          <w:lang w:val="en-US"/>
-        </w:rPr>
         <w:t>rn.patron</w:t>
       </w:r>
       <w:proofErr w:type="spellEnd"/>
-      <w:proofErr w:type="gramEnd"/>
-      <w:r>
-        <w:rPr>
-          <w:rFonts w:ascii="Consolas" w:eastAsia="Consolas" w:hAnsi="Consolas" w:cs="Consolas"/>
-          <w:sz w:val="16"/>
-          <w:szCs w:val="16"/>
-          <w:lang w:val="en-US"/>
-        </w:rPr>
-        <w:t>))</w:t>
-      </w:r>
-    </w:p>
-    <w:p>
-      <w:pPr>
-        <w:shd w:val="clear" w:color="auto" w:fill="F2F2F2"/>
-        <w:rPr>
-          <w:lang w:val="en-US"/>
-        </w:rPr>
-      </w:pPr>
-      <w:r>
-        <w:rPr>
-          <w:rFonts w:ascii="Consolas" w:eastAsia="Consolas" w:hAnsi="Consolas" w:cs="Consolas"/>
-          <w:sz w:val="16"/>
-          <w:szCs w:val="16"/>
-          <w:lang w:val="en-US"/>
-        </w:rPr>
-        <w:t xml:space="preserve">   OR (</w:t>
-      </w:r>
-      <w:proofErr w:type="spellStart"/>
-      <w:proofErr w:type="gramStart"/>
-      <w:r>
-        <w:rPr>
-          <w:rFonts w:ascii="Consolas" w:eastAsia="Consolas" w:hAnsi="Consolas" w:cs="Consolas"/>
-          <w:sz w:val="16"/>
-          <w:szCs w:val="16"/>
-          <w:lang w:val="en-US"/>
-        </w:rPr>
-        <w:t>rn.modo</w:t>
-      </w:r>
-      <w:proofErr w:type="spellEnd"/>
-      <w:proofErr w:type="gramEnd"/>
-      <w:r>
-        <w:rPr>
-          <w:rFonts w:ascii="Consolas" w:eastAsia="Consolas" w:hAnsi="Consolas" w:cs="Consolas"/>
-          <w:sz w:val="16"/>
-          <w:szCs w:val="16"/>
-          <w:lang w:val="en-US"/>
-        </w:rPr>
-        <w:t xml:space="preserve">='regex'    AND blob =~ </w:t>
-      </w:r>
-      <w:proofErr w:type="spellStart"/>
-      <w:proofErr w:type="gramStart"/>
-      <w:r>
-        <w:rPr>
-          <w:rFonts w:ascii="Consolas" w:eastAsia="Consolas" w:hAnsi="Consolas" w:cs="Consolas"/>
-          <w:sz w:val="16"/>
-          <w:szCs w:val="16"/>
-          <w:lang w:val="en-US"/>
-        </w:rPr>
-        <w:t>rn.patron</w:t>
-      </w:r>
-      <w:proofErr w:type="spellEnd"/>
-      <w:proofErr w:type="gramEnd"/>
       <w:r>
         <w:rPr>
           <w:rFonts w:ascii="Consolas" w:eastAsia="Consolas" w:hAnsi="Consolas" w:cs="Consolas"/>
@@ -6276,12 +6055,6 @@
         <w:gridCol w:w="3240"/>
       </w:tblGrid>
       <w:tr>
-        <w:tblPrEx>
-          <w:tblCellMar>
-            <w:top w:w="0" w:type="dxa"/>
-            <w:bottom w:w="0" w:type="dxa"/>
-          </w:tblCellMar>
-        </w:tblPrEx>
         <w:trPr>
           <w:tblHeader/>
         </w:trPr>
@@ -6392,12 +6165,6 @@
         </w:tc>
       </w:tr>
       <w:tr>
-        <w:tblPrEx>
-          <w:tblCellMar>
-            <w:top w:w="0" w:type="dxa"/>
-            <w:bottom w:w="0" w:type="dxa"/>
-          </w:tblCellMar>
-        </w:tblPrEx>
         <w:tc>
           <w:tcPr>
             <w:tcW w:w="4560" w:type="dxa"/>
@@ -6487,12 +6254,6 @@
         </w:tc>
       </w:tr>
       <w:tr>
-        <w:tblPrEx>
-          <w:tblCellMar>
-            <w:top w:w="0" w:type="dxa"/>
-            <w:bottom w:w="0" w:type="dxa"/>
-          </w:tblCellMar>
-        </w:tblPrEx>
         <w:tc>
           <w:tcPr>
             <w:tcW w:w="4560" w:type="dxa"/>
@@ -6582,12 +6343,6 @@
         </w:tc>
       </w:tr>
       <w:tr>
-        <w:tblPrEx>
-          <w:tblCellMar>
-            <w:top w:w="0" w:type="dxa"/>
-            <w:bottom w:w="0" w:type="dxa"/>
-          </w:tblCellMar>
-        </w:tblPrEx>
         <w:tc>
           <w:tcPr>
             <w:tcW w:w="4560" w:type="dxa"/>
@@ -6677,12 +6432,6 @@
         </w:tc>
       </w:tr>
       <w:tr>
-        <w:tblPrEx>
-          <w:tblCellMar>
-            <w:top w:w="0" w:type="dxa"/>
-            <w:bottom w:w="0" w:type="dxa"/>
-          </w:tblCellMar>
-        </w:tblPrEx>
         <w:tc>
           <w:tcPr>
             <w:tcW w:w="4560" w:type="dxa"/>
@@ -6772,12 +6521,6 @@
         </w:tc>
       </w:tr>
       <w:tr>
-        <w:tblPrEx>
-          <w:tblCellMar>
-            <w:top w:w="0" w:type="dxa"/>
-            <w:bottom w:w="0" w:type="dxa"/>
-          </w:tblCellMar>
-        </w:tblPrEx>
         <w:tc>
           <w:tcPr>
             <w:tcW w:w="4560" w:type="dxa"/>
@@ -6867,12 +6610,6 @@
         </w:tc>
       </w:tr>
       <w:tr>
-        <w:tblPrEx>
-          <w:tblCellMar>
-            <w:top w:w="0" w:type="dxa"/>
-            <w:bottom w:w="0" w:type="dxa"/>
-          </w:tblCellMar>
-        </w:tblPrEx>
         <w:tc>
           <w:tcPr>
             <w:tcW w:w="4560" w:type="dxa"/>
@@ -6962,12 +6699,6 @@
         </w:tc>
       </w:tr>
       <w:tr>
-        <w:tblPrEx>
-          <w:tblCellMar>
-            <w:top w:w="0" w:type="dxa"/>
-            <w:bottom w:w="0" w:type="dxa"/>
-          </w:tblCellMar>
-        </w:tblPrEx>
         <w:tc>
           <w:tcPr>
             <w:tcW w:w="4560" w:type="dxa"/>
@@ -7057,12 +6788,6 @@
         </w:tc>
       </w:tr>
       <w:tr>
-        <w:tblPrEx>
-          <w:tblCellMar>
-            <w:top w:w="0" w:type="dxa"/>
-            <w:bottom w:w="0" w:type="dxa"/>
-          </w:tblCellMar>
-        </w:tblPrEx>
         <w:tc>
           <w:tcPr>
             <w:tcW w:w="4560" w:type="dxa"/>
@@ -7152,12 +6877,6 @@
         </w:tc>
       </w:tr>
       <w:tr>
-        <w:tblPrEx>
-          <w:tblCellMar>
-            <w:top w:w="0" w:type="dxa"/>
-            <w:bottom w:w="0" w:type="dxa"/>
-          </w:tblCellMar>
-        </w:tblPrEx>
         <w:tc>
           <w:tcPr>
             <w:tcW w:w="4560" w:type="dxa"/>
@@ -7247,12 +6966,6 @@
         </w:tc>
       </w:tr>
       <w:tr>
-        <w:tblPrEx>
-          <w:tblCellMar>
-            <w:top w:w="0" w:type="dxa"/>
-            <w:bottom w:w="0" w:type="dxa"/>
-          </w:tblCellMar>
-        </w:tblPrEx>
         <w:tc>
           <w:tcPr>
             <w:tcW w:w="4560" w:type="dxa"/>
@@ -7342,12 +7055,6 @@
         </w:tc>
       </w:tr>
       <w:tr>
-        <w:tblPrEx>
-          <w:tblCellMar>
-            <w:top w:w="0" w:type="dxa"/>
-            <w:bottom w:w="0" w:type="dxa"/>
-          </w:tblCellMar>
-        </w:tblPrEx>
         <w:tc>
           <w:tcPr>
             <w:tcW w:w="4560" w:type="dxa"/>
@@ -7437,12 +7144,6 @@
         </w:tc>
       </w:tr>
       <w:tr>
-        <w:tblPrEx>
-          <w:tblCellMar>
-            <w:top w:w="0" w:type="dxa"/>
-            <w:bottom w:w="0" w:type="dxa"/>
-          </w:tblCellMar>
-        </w:tblPrEx>
         <w:tc>
           <w:tcPr>
             <w:tcW w:w="4560" w:type="dxa"/>
@@ -7532,12 +7233,6 @@
         </w:tc>
       </w:tr>
       <w:tr>
-        <w:tblPrEx>
-          <w:tblCellMar>
-            <w:top w:w="0" w:type="dxa"/>
-            <w:bottom w:w="0" w:type="dxa"/>
-          </w:tblCellMar>
-        </w:tblPrEx>
         <w:tc>
           <w:tcPr>
             <w:tcW w:w="4560" w:type="dxa"/>
@@ -7627,12 +7322,6 @@
         </w:tc>
       </w:tr>
       <w:tr>
-        <w:tblPrEx>
-          <w:tblCellMar>
-            <w:top w:w="0" w:type="dxa"/>
-            <w:bottom w:w="0" w:type="dxa"/>
-          </w:tblCellMar>
-        </w:tblPrEx>
         <w:tc>
           <w:tcPr>
             <w:tcW w:w="4560" w:type="dxa"/>
@@ -7732,12 +7421,6 @@
         </w:tc>
       </w:tr>
       <w:tr>
-        <w:tblPrEx>
-          <w:tblCellMar>
-            <w:top w:w="0" w:type="dxa"/>
-            <w:bottom w:w="0" w:type="dxa"/>
-          </w:tblCellMar>
-        </w:tblPrEx>
         <w:tc>
           <w:tcPr>
             <w:tcW w:w="4560" w:type="dxa"/>
@@ -8397,12 +8080,6 @@
         <w:gridCol w:w="9600"/>
       </w:tblGrid>
       <w:tr>
-        <w:tblPrEx>
-          <w:tblCellMar>
-            <w:top w:w="0" w:type="dxa"/>
-            <w:bottom w:w="0" w:type="dxa"/>
-          </w:tblCellMar>
-        </w:tblPrEx>
         <w:tc>
           <w:tcPr>
             <w:tcW w:w="9360" w:type="dxa"/>
@@ -8452,7 +8129,7 @@
                           </pic:cNvPicPr>
                         </pic:nvPicPr>
                         <pic:blipFill>
-                          <a:blip r:embed="rId9">
+                          <a:blip r:embed="rId12">
                             <a:extLst>
                               <a:ext uri="{28A0092B-C50C-407E-A947-70E740481C1C}">
                                 <a14:useLocalDpi xmlns:a14="http://schemas.microsoft.com/office/drawing/2010/main" val="0"/>
@@ -8507,10 +8184,7 @@
         <w:pStyle w:val="Ttulo2"/>
       </w:pPr>
       <w:r>
-        <w:t>2.4 Consultas</w:t>
-      </w:r>
-      <w:r>
-        <w:t xml:space="preserve"> de </w:t>
+        <w:t xml:space="preserve">2.4 Consultas de </w:t>
       </w:r>
       <w:proofErr w:type="spellStart"/>
       <w:r>
@@ -8953,12 +8627,6 @@
         <w:gridCol w:w="9600"/>
       </w:tblGrid>
       <w:tr>
-        <w:tblPrEx>
-          <w:tblCellMar>
-            <w:top w:w="0" w:type="dxa"/>
-            <w:bottom w:w="0" w:type="dxa"/>
-          </w:tblCellMar>
-        </w:tblPrEx>
         <w:tc>
           <w:tcPr>
             <w:tcW w:w="9360" w:type="dxa"/>
@@ -8991,7 +8659,7 @@
               </w:rPr>
               <w:lastRenderedPageBreak/>
               <w:drawing>
-                <wp:inline distT="0" distB="0" distL="0" distR="0" wp14:anchorId="3E6A4BEA" wp14:editId="0C3606AB">
+                <wp:inline distT="0" distB="0" distL="0" distR="0" wp14:anchorId="3E6A4BEA" wp14:editId="4B4BCA70">
                   <wp:extent cx="5943600" cy="1990725"/>
                   <wp:effectExtent l="0" t="0" r="0" b="9525"/>
                   <wp:docPr id="222358857" name="Imagen 5"/>
@@ -9008,7 +8676,7 @@
                           </pic:cNvPicPr>
                         </pic:nvPicPr>
                         <pic:blipFill>
-                          <a:blip r:embed="rId10" cstate="print">
+                          <a:blip r:embed="rId13" cstate="print">
                             <a:extLst>
                               <a:ext uri="{28A0092B-C50C-407E-A947-70E740481C1C}">
                                 <a14:useLocalDpi xmlns:a14="http://schemas.microsoft.com/office/drawing/2010/main" val="0"/>
@@ -9388,7 +9056,6 @@
         <w:t xml:space="preserve">RETURN n.name, </w:t>
       </w:r>
       <w:proofErr w:type="spellStart"/>
-      <w:proofErr w:type="gramStart"/>
       <w:r>
         <w:rPr>
           <w:rFonts w:ascii="Consolas" w:eastAsia="Consolas" w:hAnsi="Consolas" w:cs="Consolas"/>
@@ -9399,7 +9066,6 @@
         <w:t>c.valor</w:t>
       </w:r>
       <w:proofErr w:type="spellEnd"/>
-      <w:proofErr w:type="gramEnd"/>
       <w:r>
         <w:rPr>
           <w:rFonts w:ascii="Consolas" w:eastAsia="Consolas" w:hAnsi="Consolas" w:cs="Consolas"/>
@@ -9410,7 +9076,6 @@
         <w:t xml:space="preserve">, </w:t>
       </w:r>
       <w:proofErr w:type="spellStart"/>
-      <w:proofErr w:type="gramStart"/>
       <w:r>
         <w:rPr>
           <w:rFonts w:ascii="Consolas" w:eastAsia="Consolas" w:hAnsi="Consolas" w:cs="Consolas"/>
@@ -9421,7 +9086,6 @@
         <w:t>e.texto</w:t>
       </w:r>
       <w:proofErr w:type="spellEnd"/>
-      <w:proofErr w:type="gramEnd"/>
       <w:r>
         <w:rPr>
           <w:rFonts w:ascii="Consolas" w:eastAsia="Consolas" w:hAnsi="Consolas" w:cs="Consolas"/>
@@ -9446,9 +9110,9 @@
           <w:szCs w:val="16"/>
           <w:lang w:val="en-US"/>
         </w:rPr>
-        <w:t xml:space="preserve">       </w:t>
-      </w:r>
-      <w:proofErr w:type="gramStart"/>
+        <w:t xml:space="preserve">       collect(DISTINCT </w:t>
+      </w:r>
+      <w:proofErr w:type="spellStart"/>
       <w:r>
         <w:rPr>
           <w:rFonts w:ascii="Consolas" w:eastAsia="Consolas" w:hAnsi="Consolas" w:cs="Consolas"/>
@@ -9456,31 +9120,9 @@
           <w:szCs w:val="16"/>
           <w:lang w:val="en-US"/>
         </w:rPr>
-        <w:t>collect(</w:t>
-      </w:r>
-      <w:proofErr w:type="gramEnd"/>
-      <w:r>
-        <w:rPr>
-          <w:rFonts w:ascii="Consolas" w:eastAsia="Consolas" w:hAnsi="Consolas" w:cs="Consolas"/>
-          <w:sz w:val="16"/>
-          <w:szCs w:val="16"/>
-          <w:lang w:val="en-US"/>
-        </w:rPr>
-        <w:t xml:space="preserve">DISTINCT </w:t>
-      </w:r>
-      <w:proofErr w:type="spellStart"/>
-      <w:proofErr w:type="gramStart"/>
-      <w:r>
-        <w:rPr>
-          <w:rFonts w:ascii="Consolas" w:eastAsia="Consolas" w:hAnsi="Consolas" w:cs="Consolas"/>
-          <w:sz w:val="16"/>
-          <w:szCs w:val="16"/>
-          <w:lang w:val="en-US"/>
-        </w:rPr>
         <w:t>rn.nombre</w:t>
       </w:r>
       <w:proofErr w:type="spellEnd"/>
-      <w:proofErr w:type="gramEnd"/>
       <w:r>
         <w:rPr>
           <w:rFonts w:ascii="Consolas" w:eastAsia="Consolas" w:hAnsi="Consolas" w:cs="Consolas"/>
@@ -9529,9 +9171,9 @@
           <w:szCs w:val="16"/>
           <w:lang w:val="en-US"/>
         </w:rPr>
-        <w:t xml:space="preserve">       </w:t>
-      </w:r>
-      <w:proofErr w:type="gramStart"/>
+        <w:t xml:space="preserve">       collect(DISTINCT </w:t>
+      </w:r>
+      <w:proofErr w:type="spellStart"/>
       <w:r>
         <w:rPr>
           <w:rFonts w:ascii="Consolas" w:eastAsia="Consolas" w:hAnsi="Consolas" w:cs="Consolas"/>
@@ -9539,31 +9181,9 @@
           <w:szCs w:val="16"/>
           <w:lang w:val="en-US"/>
         </w:rPr>
-        <w:t>collect(</w:t>
-      </w:r>
-      <w:proofErr w:type="gramEnd"/>
-      <w:r>
-        <w:rPr>
-          <w:rFonts w:ascii="Consolas" w:eastAsia="Consolas" w:hAnsi="Consolas" w:cs="Consolas"/>
-          <w:sz w:val="16"/>
-          <w:szCs w:val="16"/>
-          <w:lang w:val="en-US"/>
-        </w:rPr>
-        <w:t xml:space="preserve">DISTINCT </w:t>
-      </w:r>
-      <w:proofErr w:type="spellStart"/>
-      <w:proofErr w:type="gramStart"/>
-      <w:r>
-        <w:rPr>
-          <w:rFonts w:ascii="Consolas" w:eastAsia="Consolas" w:hAnsi="Consolas" w:cs="Consolas"/>
-          <w:sz w:val="16"/>
-          <w:szCs w:val="16"/>
-          <w:lang w:val="en-US"/>
-        </w:rPr>
         <w:t>ev.fragmento</w:t>
       </w:r>
       <w:proofErr w:type="spellEnd"/>
-      <w:proofErr w:type="gramEnd"/>
       <w:r>
         <w:rPr>
           <w:rFonts w:ascii="Consolas" w:eastAsia="Consolas" w:hAnsi="Consolas" w:cs="Consolas"/>
@@ -9615,12 +9235,6 @@
         <w:gridCol w:w="9600"/>
       </w:tblGrid>
       <w:tr>
-        <w:tblPrEx>
-          <w:tblCellMar>
-            <w:top w:w="0" w:type="dxa"/>
-            <w:bottom w:w="0" w:type="dxa"/>
-          </w:tblCellMar>
-        </w:tblPrEx>
         <w:tc>
           <w:tcPr>
             <w:tcW w:w="9360" w:type="dxa"/>
@@ -9670,7 +9284,7 @@
                           </pic:cNvPicPr>
                         </pic:nvPicPr>
                         <pic:blipFill>
-                          <a:blip r:embed="rId11">
+                          <a:blip r:embed="rId14">
                             <a:extLst>
                               <a:ext uri="{28A0092B-C50C-407E-A947-70E740481C1C}">
                                 <a14:useLocalDpi xmlns:a14="http://schemas.microsoft.com/office/drawing/2010/main" val="0"/>
@@ -9915,9 +9529,9 @@
           <w:szCs w:val="16"/>
           <w:lang w:val="en-US"/>
         </w:rPr>
-        <w:t xml:space="preserve">RETURN n.name, </w:t>
-      </w:r>
-      <w:proofErr w:type="gramStart"/>
+        <w:t xml:space="preserve">RETURN n.name, count(DISTINCT </w:t>
+      </w:r>
+      <w:proofErr w:type="spellStart"/>
       <w:r>
         <w:rPr>
           <w:rFonts w:ascii="Consolas" w:eastAsia="Consolas" w:hAnsi="Consolas" w:cs="Consolas"/>
@@ -9925,9 +9539,9 @@
           <w:szCs w:val="16"/>
           <w:lang w:val="en-US"/>
         </w:rPr>
-        <w:t>count(</w:t>
-      </w:r>
-      <w:proofErr w:type="gramEnd"/>
+        <w:t>rn</w:t>
+      </w:r>
+      <w:proofErr w:type="spellEnd"/>
       <w:r>
         <w:rPr>
           <w:rFonts w:ascii="Consolas" w:eastAsia="Consolas" w:hAnsi="Consolas" w:cs="Consolas"/>
@@ -9935,7 +9549,7 @@
           <w:szCs w:val="16"/>
           <w:lang w:val="en-US"/>
         </w:rPr>
-        <w:t xml:space="preserve">DISTINCT </w:t>
+        <w:t xml:space="preserve">) AS </w:t>
       </w:r>
       <w:proofErr w:type="spellStart"/>
       <w:r>
@@ -9945,7 +9559,7 @@
           <w:szCs w:val="16"/>
           <w:lang w:val="en-US"/>
         </w:rPr>
-        <w:t>rn</w:t>
+        <w:t>n_reglas</w:t>
       </w:r>
       <w:proofErr w:type="spellEnd"/>
       <w:r>
@@ -9955,6 +9569,44 @@
           <w:szCs w:val="16"/>
           <w:lang w:val="en-US"/>
         </w:rPr>
+        <w:t>,</w:t>
+      </w:r>
+    </w:p>
+    <w:p>
+      <w:pPr>
+        <w:shd w:val="clear" w:color="auto" w:fill="F2F2F2"/>
+        <w:rPr>
+          <w:lang w:val="en-US"/>
+        </w:rPr>
+      </w:pPr>
+      <w:r>
+        <w:rPr>
+          <w:rFonts w:ascii="Consolas" w:eastAsia="Consolas" w:hAnsi="Consolas" w:cs="Consolas"/>
+          <w:sz w:val="16"/>
+          <w:szCs w:val="16"/>
+          <w:lang w:val="en-US"/>
+        </w:rPr>
+        <w:lastRenderedPageBreak/>
+        <w:t xml:space="preserve">       collect(DISTINCT </w:t>
+      </w:r>
+      <w:proofErr w:type="spellStart"/>
+      <w:r>
+        <w:rPr>
+          <w:rFonts w:ascii="Consolas" w:eastAsia="Consolas" w:hAnsi="Consolas" w:cs="Consolas"/>
+          <w:sz w:val="16"/>
+          <w:szCs w:val="16"/>
+          <w:lang w:val="en-US"/>
+        </w:rPr>
+        <w:t>rn.nombre</w:t>
+      </w:r>
+      <w:proofErr w:type="spellEnd"/>
+      <w:r>
+        <w:rPr>
+          <w:rFonts w:ascii="Consolas" w:eastAsia="Consolas" w:hAnsi="Consolas" w:cs="Consolas"/>
+          <w:sz w:val="16"/>
+          <w:szCs w:val="16"/>
+          <w:lang w:val="en-US"/>
+        </w:rPr>
         <w:t xml:space="preserve">) AS </w:t>
       </w:r>
       <w:proofErr w:type="spellStart"/>
@@ -9965,7 +9617,7 @@
           <w:szCs w:val="16"/>
           <w:lang w:val="en-US"/>
         </w:rPr>
-        <w:t>n_reglas</w:t>
+        <w:t>reglas</w:t>
       </w:r>
       <w:proofErr w:type="spellEnd"/>
       <w:r>
@@ -9975,107 +9627,7 @@
           <w:szCs w:val="16"/>
           <w:lang w:val="en-US"/>
         </w:rPr>
-        <w:t>,</w:t>
-      </w:r>
-    </w:p>
-    <w:p>
-      <w:pPr>
-        <w:shd w:val="clear" w:color="auto" w:fill="F2F2F2"/>
-        <w:rPr>
-          <w:lang w:val="en-US"/>
-        </w:rPr>
-      </w:pPr>
-      <w:r>
-        <w:rPr>
-          <w:rFonts w:ascii="Consolas" w:eastAsia="Consolas" w:hAnsi="Consolas" w:cs="Consolas"/>
-          <w:sz w:val="16"/>
-          <w:szCs w:val="16"/>
-          <w:lang w:val="en-US"/>
-        </w:rPr>
-        <w:lastRenderedPageBreak/>
-        <w:t xml:space="preserve">       </w:t>
-      </w:r>
-      <w:proofErr w:type="gramStart"/>
-      <w:r>
-        <w:rPr>
-          <w:rFonts w:ascii="Consolas" w:eastAsia="Consolas" w:hAnsi="Consolas" w:cs="Consolas"/>
-          <w:sz w:val="16"/>
-          <w:szCs w:val="16"/>
-          <w:lang w:val="en-US"/>
-        </w:rPr>
-        <w:t>collect(</w:t>
-      </w:r>
-      <w:proofErr w:type="gramEnd"/>
-      <w:r>
-        <w:rPr>
-          <w:rFonts w:ascii="Consolas" w:eastAsia="Consolas" w:hAnsi="Consolas" w:cs="Consolas"/>
-          <w:sz w:val="16"/>
-          <w:szCs w:val="16"/>
-          <w:lang w:val="en-US"/>
-        </w:rPr>
-        <w:t xml:space="preserve">DISTINCT </w:t>
-      </w:r>
-      <w:proofErr w:type="spellStart"/>
-      <w:proofErr w:type="gramStart"/>
-      <w:r>
-        <w:rPr>
-          <w:rFonts w:ascii="Consolas" w:eastAsia="Consolas" w:hAnsi="Consolas" w:cs="Consolas"/>
-          <w:sz w:val="16"/>
-          <w:szCs w:val="16"/>
-          <w:lang w:val="en-US"/>
-        </w:rPr>
-        <w:t>rn.nombre</w:t>
-      </w:r>
-      <w:proofErr w:type="spellEnd"/>
-      <w:proofErr w:type="gramEnd"/>
-      <w:r>
-        <w:rPr>
-          <w:rFonts w:ascii="Consolas" w:eastAsia="Consolas" w:hAnsi="Consolas" w:cs="Consolas"/>
-          <w:sz w:val="16"/>
-          <w:szCs w:val="16"/>
-          <w:lang w:val="en-US"/>
-        </w:rPr>
-        <w:t xml:space="preserve">) AS </w:t>
-      </w:r>
-      <w:proofErr w:type="spellStart"/>
-      <w:r>
-        <w:rPr>
-          <w:rFonts w:ascii="Consolas" w:eastAsia="Consolas" w:hAnsi="Consolas" w:cs="Consolas"/>
-          <w:sz w:val="16"/>
-          <w:szCs w:val="16"/>
-          <w:lang w:val="en-US"/>
-        </w:rPr>
-        <w:t>reglas</w:t>
-      </w:r>
-      <w:proofErr w:type="spellEnd"/>
-      <w:r>
-        <w:rPr>
-          <w:rFonts w:ascii="Consolas" w:eastAsia="Consolas" w:hAnsi="Consolas" w:cs="Consolas"/>
-          <w:sz w:val="16"/>
-          <w:szCs w:val="16"/>
-          <w:lang w:val="en-US"/>
-        </w:rPr>
-        <w:t xml:space="preserve">, </w:t>
-      </w:r>
-      <w:proofErr w:type="gramStart"/>
-      <w:r>
-        <w:rPr>
-          <w:rFonts w:ascii="Consolas" w:eastAsia="Consolas" w:hAnsi="Consolas" w:cs="Consolas"/>
-          <w:sz w:val="16"/>
-          <w:szCs w:val="16"/>
-          <w:lang w:val="en-US"/>
-        </w:rPr>
-        <w:t>count(</w:t>
-      </w:r>
-      <w:proofErr w:type="gramEnd"/>
-      <w:r>
-        <w:rPr>
-          <w:rFonts w:ascii="Consolas" w:eastAsia="Consolas" w:hAnsi="Consolas" w:cs="Consolas"/>
-          <w:sz w:val="16"/>
-          <w:szCs w:val="16"/>
-          <w:lang w:val="en-US"/>
-        </w:rPr>
-        <w:t xml:space="preserve">DISTINCT </w:t>
+        <w:t xml:space="preserve">, count(DISTINCT </w:t>
       </w:r>
       <w:proofErr w:type="spellStart"/>
       <w:r>
@@ -10195,12 +9747,6 @@
         <w:gridCol w:w="9600"/>
       </w:tblGrid>
       <w:tr>
-        <w:tblPrEx>
-          <w:tblCellMar>
-            <w:top w:w="0" w:type="dxa"/>
-            <w:bottom w:w="0" w:type="dxa"/>
-          </w:tblCellMar>
-        </w:tblPrEx>
         <w:tc>
           <w:tcPr>
             <w:tcW w:w="9360" w:type="dxa"/>
@@ -10249,7 +9795,7 @@
                           </pic:cNvPicPr>
                         </pic:nvPicPr>
                         <pic:blipFill>
-                          <a:blip r:embed="rId12">
+                          <a:blip r:embed="rId15">
                             <a:extLst>
                               <a:ext uri="{28A0092B-C50C-407E-A947-70E740481C1C}">
                                 <a14:useLocalDpi xmlns:a14="http://schemas.microsoft.com/office/drawing/2010/main" val="0"/>
@@ -10405,25 +9951,7 @@
           <w:sz w:val="16"/>
           <w:szCs w:val="16"/>
         </w:rPr>
-        <w:t xml:space="preserve">RETURN 'No Relevante </w:t>
-      </w:r>
-      <w:proofErr w:type="gramStart"/>
-      <w:r>
-        <w:rPr>
-          <w:rFonts w:ascii="Consolas" w:eastAsia="Consolas" w:hAnsi="Consolas" w:cs="Consolas"/>
-          <w:sz w:val="16"/>
-          <w:szCs w:val="16"/>
-        </w:rPr>
-        <w:t>activa reglas</w:t>
-      </w:r>
-      <w:proofErr w:type="gramEnd"/>
-      <w:r>
-        <w:rPr>
-          <w:rFonts w:ascii="Consolas" w:eastAsia="Consolas" w:hAnsi="Consolas" w:cs="Consolas"/>
-          <w:sz w:val="16"/>
-          <w:szCs w:val="16"/>
-        </w:rPr>
-        <w:t>' AS tipo, n.name,</w:t>
+        <w:t>RETURN 'No Relevante activa reglas' AS tipo, n.name,</w:t>
       </w:r>
     </w:p>
     <w:p>
@@ -10441,7 +9969,6 @@
         </w:rPr>
         <w:t xml:space="preserve">       </w:t>
       </w:r>
-      <w:proofErr w:type="gramStart"/>
       <w:r>
         <w:rPr>
           <w:rFonts w:ascii="Consolas" w:eastAsia="Consolas" w:hAnsi="Consolas" w:cs="Consolas"/>
@@ -10449,9 +9976,9 @@
           <w:szCs w:val="16"/>
           <w:lang w:val="en-US"/>
         </w:rPr>
-        <w:t>count(</w:t>
-      </w:r>
-      <w:proofErr w:type="gramEnd"/>
+        <w:t xml:space="preserve">count(DISTINCT </w:t>
+      </w:r>
+      <w:proofErr w:type="spellStart"/>
       <w:r>
         <w:rPr>
           <w:rFonts w:ascii="Consolas" w:eastAsia="Consolas" w:hAnsi="Consolas" w:cs="Consolas"/>
@@ -10459,9 +9986,9 @@
           <w:szCs w:val="16"/>
           <w:lang w:val="en-US"/>
         </w:rPr>
-        <w:t xml:space="preserve">DISTINCT </w:t>
-      </w:r>
-      <w:proofErr w:type="spellStart"/>
+        <w:t>rn</w:t>
+      </w:r>
+      <w:proofErr w:type="spellEnd"/>
       <w:r>
         <w:rPr>
           <w:rFonts w:ascii="Consolas" w:eastAsia="Consolas" w:hAnsi="Consolas" w:cs="Consolas"/>
@@ -10469,9 +9996,9 @@
           <w:szCs w:val="16"/>
           <w:lang w:val="en-US"/>
         </w:rPr>
-        <w:t>rn</w:t>
-      </w:r>
-      <w:proofErr w:type="spellEnd"/>
+        <w:t xml:space="preserve">) AS </w:t>
+      </w:r>
+      <w:proofErr w:type="spellStart"/>
       <w:r>
         <w:rPr>
           <w:rFonts w:ascii="Consolas" w:eastAsia="Consolas" w:hAnsi="Consolas" w:cs="Consolas"/>
@@ -10479,9 +10006,9 @@
           <w:szCs w:val="16"/>
           <w:lang w:val="en-US"/>
         </w:rPr>
-        <w:t xml:space="preserve">) AS </w:t>
-      </w:r>
-      <w:proofErr w:type="spellStart"/>
+        <w:t>n_reglas</w:t>
+      </w:r>
+      <w:proofErr w:type="spellEnd"/>
       <w:r>
         <w:rPr>
           <w:rFonts w:ascii="Consolas" w:eastAsia="Consolas" w:hAnsi="Consolas" w:cs="Consolas"/>
@@ -10489,6 +10016,16 @@
           <w:szCs w:val="16"/>
           <w:lang w:val="en-US"/>
         </w:rPr>
+        <w:t xml:space="preserve"> ORDER BY </w:t>
+      </w:r>
+      <w:proofErr w:type="spellStart"/>
+      <w:r>
+        <w:rPr>
+          <w:rFonts w:ascii="Consolas" w:eastAsia="Consolas" w:hAnsi="Consolas" w:cs="Consolas"/>
+          <w:sz w:val="16"/>
+          <w:szCs w:val="16"/>
+          <w:lang w:val="en-US"/>
+        </w:rPr>
         <w:t>n_reglas</w:t>
       </w:r>
       <w:proofErr w:type="spellEnd"/>
@@ -10499,19 +10036,16 @@
           <w:szCs w:val="16"/>
           <w:lang w:val="en-US"/>
         </w:rPr>
-        <w:t xml:space="preserve"> ORDER BY </w:t>
-      </w:r>
-      <w:proofErr w:type="spellStart"/>
-      <w:r>
-        <w:rPr>
-          <w:rFonts w:ascii="Consolas" w:eastAsia="Consolas" w:hAnsi="Consolas" w:cs="Consolas"/>
-          <w:sz w:val="16"/>
-          <w:szCs w:val="16"/>
+        <w:t xml:space="preserve"> DESC</w:t>
+      </w:r>
+    </w:p>
+    <w:p>
+      <w:pPr>
+        <w:shd w:val="clear" w:color="auto" w:fill="F2F2F2"/>
+        <w:rPr>
           <w:lang w:val="en-US"/>
         </w:rPr>
-        <w:t>n_reglas</w:t>
-      </w:r>
-      <w:proofErr w:type="spellEnd"/>
+      </w:pPr>
       <w:r>
         <w:rPr>
           <w:rFonts w:ascii="Consolas" w:eastAsia="Consolas" w:hAnsi="Consolas" w:cs="Consolas"/>
@@ -10519,7 +10053,7 @@
           <w:szCs w:val="16"/>
           <w:lang w:val="en-US"/>
         </w:rPr>
-        <w:t xml:space="preserve"> DESC</w:t>
+        <w:t>UNION</w:t>
       </w:r>
     </w:p>
     <w:p>
@@ -10536,16 +10070,19 @@
           <w:szCs w:val="16"/>
           <w:lang w:val="en-US"/>
         </w:rPr>
-        <w:t>UNION</w:t>
-      </w:r>
-    </w:p>
-    <w:p>
-      <w:pPr>
-        <w:shd w:val="clear" w:color="auto" w:fill="F2F2F2"/>
-        <w:rPr>
+        <w:t>MATCH (</w:t>
+      </w:r>
+      <w:proofErr w:type="spellStart"/>
+      <w:r>
+        <w:rPr>
+          <w:rFonts w:ascii="Consolas" w:eastAsia="Consolas" w:hAnsi="Consolas" w:cs="Consolas"/>
+          <w:sz w:val="16"/>
+          <w:szCs w:val="16"/>
           <w:lang w:val="en-US"/>
         </w:rPr>
-      </w:pPr>
+        <w:t>n:Relevante</w:t>
+      </w:r>
+      <w:proofErr w:type="spellEnd"/>
       <w:r>
         <w:rPr>
           <w:rFonts w:ascii="Consolas" w:eastAsia="Consolas" w:hAnsi="Consolas" w:cs="Consolas"/>
@@ -10553,69 +10090,7 @@
           <w:szCs w:val="16"/>
           <w:lang w:val="en-US"/>
         </w:rPr>
-        <w:t>MATCH (</w:t>
-      </w:r>
-      <w:proofErr w:type="spellStart"/>
-      <w:proofErr w:type="gramStart"/>
-      <w:r>
-        <w:rPr>
-          <w:rFonts w:ascii="Consolas" w:eastAsia="Consolas" w:hAnsi="Consolas" w:cs="Consolas"/>
-          <w:sz w:val="16"/>
-          <w:szCs w:val="16"/>
-          <w:lang w:val="en-US"/>
-        </w:rPr>
-        <w:t>n:Relevante</w:t>
-      </w:r>
-      <w:proofErr w:type="spellEnd"/>
-      <w:proofErr w:type="gramEnd"/>
-      <w:r>
-        <w:rPr>
-          <w:rFonts w:ascii="Consolas" w:eastAsia="Consolas" w:hAnsi="Consolas" w:cs="Consolas"/>
-          <w:sz w:val="16"/>
-          <w:szCs w:val="16"/>
-          <w:lang w:val="en-US"/>
-        </w:rPr>
-        <w:t>) WHERE NOT (n)-</w:t>
-      </w:r>
-      <w:proofErr w:type="gramStart"/>
-      <w:r>
-        <w:rPr>
-          <w:rFonts w:ascii="Consolas" w:eastAsia="Consolas" w:hAnsi="Consolas" w:cs="Consolas"/>
-          <w:sz w:val="16"/>
-          <w:szCs w:val="16"/>
-          <w:lang w:val="en-US"/>
-        </w:rPr>
-        <w:t>[:ACTIVA</w:t>
-      </w:r>
-      <w:proofErr w:type="gramEnd"/>
-      <w:r>
-        <w:rPr>
-          <w:rFonts w:ascii="Consolas" w:eastAsia="Consolas" w:hAnsi="Consolas" w:cs="Consolas"/>
-          <w:sz w:val="16"/>
-          <w:szCs w:val="16"/>
-          <w:lang w:val="en-US"/>
-        </w:rPr>
-        <w:t>_REGLA]-</w:t>
-      </w:r>
-      <w:proofErr w:type="gramStart"/>
-      <w:r>
-        <w:rPr>
-          <w:rFonts w:ascii="Consolas" w:eastAsia="Consolas" w:hAnsi="Consolas" w:cs="Consolas"/>
-          <w:sz w:val="16"/>
-          <w:szCs w:val="16"/>
-          <w:lang w:val="en-US"/>
-        </w:rPr>
-        <w:t>&gt;(</w:t>
-      </w:r>
-      <w:proofErr w:type="gramEnd"/>
-      <w:r>
-        <w:rPr>
-          <w:rFonts w:ascii="Consolas" w:eastAsia="Consolas" w:hAnsi="Consolas" w:cs="Consolas"/>
-          <w:sz w:val="16"/>
-          <w:szCs w:val="16"/>
-          <w:lang w:val="en-US"/>
-        </w:rPr>
-        <w:t>)</w:t>
+        <w:t>) WHERE NOT (n)-[:ACTIVA_REGLA]-&gt;()</w:t>
       </w:r>
     </w:p>
     <w:p>
@@ -10686,12 +10161,6 @@
         <w:gridCol w:w="9600"/>
       </w:tblGrid>
       <w:tr>
-        <w:tblPrEx>
-          <w:tblCellMar>
-            <w:top w:w="0" w:type="dxa"/>
-            <w:bottom w:w="0" w:type="dxa"/>
-          </w:tblCellMar>
-        </w:tblPrEx>
         <w:tc>
           <w:tcPr>
             <w:tcW w:w="9360" w:type="dxa"/>
@@ -10741,7 +10210,7 @@
                           </pic:cNvPicPr>
                         </pic:nvPicPr>
                         <pic:blipFill>
-                          <a:blip r:embed="rId13">
+                          <a:blip r:embed="rId16">
                             <a:extLst>
                               <a:ext uri="{28A0092B-C50C-407E-A947-70E740481C1C}">
                                 <a14:useLocalDpi xmlns:a14="http://schemas.microsoft.com/office/drawing/2010/main" val="0"/>
@@ -10827,12 +10296,6 @@
     </w:p>
     <w:p>
       <w:pPr>
-        <w:spacing w:after="120" w:line="276" w:lineRule="auto"/>
-        <w:jc w:val="both"/>
-      </w:pPr>
-    </w:p>
-    <w:p>
-      <w:pPr>
         <w:shd w:val="clear" w:color="auto" w:fill="F2F2F2"/>
       </w:pPr>
       <w:r>
@@ -11135,7 +10598,6 @@
         <w:t xml:space="preserve">CASE WHEN </w:t>
       </w:r>
       <w:proofErr w:type="spellStart"/>
-      <w:proofErr w:type="gramStart"/>
       <w:r>
         <w:rPr>
           <w:rFonts w:ascii="Consolas" w:eastAsia="Consolas" w:hAnsi="Consolas" w:cs="Consolas"/>
@@ -11146,7 +10608,6 @@
         <w:t>c.valor</w:t>
       </w:r>
       <w:proofErr w:type="spellEnd"/>
-      <w:proofErr w:type="gramEnd"/>
       <w:r>
         <w:rPr>
           <w:rFonts w:ascii="Consolas" w:eastAsia="Consolas" w:hAnsi="Consolas" w:cs="Consolas"/>
@@ -11174,9 +10635,9 @@
           <w:szCs w:val="16"/>
           <w:lang w:val="en-US"/>
         </w:rPr>
-        <w:t xml:space="preserve">' AND </w:t>
-      </w:r>
-      <w:proofErr w:type="gramStart"/>
+        <w:t xml:space="preserve">' AND count(DISTINCT </w:t>
+      </w:r>
+      <w:proofErr w:type="spellStart"/>
       <w:r>
         <w:rPr>
           <w:rFonts w:ascii="Consolas" w:eastAsia="Consolas" w:hAnsi="Consolas" w:cs="Consolas"/>
@@ -11184,9 +10645,9 @@
           <w:szCs w:val="16"/>
           <w:lang w:val="en-US"/>
         </w:rPr>
-        <w:t>count(</w:t>
-      </w:r>
-      <w:proofErr w:type="gramEnd"/>
+        <w:t>rn</w:t>
+      </w:r>
+      <w:proofErr w:type="spellEnd"/>
       <w:r>
         <w:rPr>
           <w:rFonts w:ascii="Consolas" w:eastAsia="Consolas" w:hAnsi="Consolas" w:cs="Consolas"/>
@@ -11194,9 +10655,13 @@
           <w:szCs w:val="16"/>
           <w:lang w:val="en-US"/>
         </w:rPr>
-        <w:t xml:space="preserve">DISTINCT </w:t>
-      </w:r>
-      <w:proofErr w:type="spellStart"/>
+        <w:t>)&gt;0</w:t>
+      </w:r>
+    </w:p>
+    <w:p>
+      <w:pPr>
+        <w:shd w:val="clear" w:color="auto" w:fill="F2F2F2"/>
+      </w:pPr>
       <w:r>
         <w:rPr>
           <w:rFonts w:ascii="Consolas" w:eastAsia="Consolas" w:hAnsi="Consolas" w:cs="Consolas"/>
@@ -11204,30 +10669,6 @@
           <w:szCs w:val="16"/>
           <w:lang w:val="en-US"/>
         </w:rPr>
-        <w:t>rn</w:t>
-      </w:r>
-      <w:proofErr w:type="spellEnd"/>
-      <w:r>
-        <w:rPr>
-          <w:rFonts w:ascii="Consolas" w:eastAsia="Consolas" w:hAnsi="Consolas" w:cs="Consolas"/>
-          <w:sz w:val="16"/>
-          <w:szCs w:val="16"/>
-          <w:lang w:val="en-US"/>
-        </w:rPr>
-        <w:t>)&gt;0</w:t>
-      </w:r>
-    </w:p>
-    <w:p>
-      <w:pPr>
-        <w:shd w:val="clear" w:color="auto" w:fill="F2F2F2"/>
-      </w:pPr>
-      <w:r>
-        <w:rPr>
-          <w:rFonts w:ascii="Consolas" w:eastAsia="Consolas" w:hAnsi="Consolas" w:cs="Consolas"/>
-          <w:sz w:val="16"/>
-          <w:szCs w:val="16"/>
-          <w:lang w:val="en-US"/>
-        </w:rPr>
         <w:t xml:space="preserve">            </w:t>
       </w:r>
       <w:r>
@@ -11236,25 +10677,7 @@
           <w:sz w:val="16"/>
           <w:szCs w:val="16"/>
         </w:rPr>
-        <w:t xml:space="preserve">THEN 'No Relevante </w:t>
-      </w:r>
-      <w:proofErr w:type="gramStart"/>
-      <w:r>
-        <w:rPr>
-          <w:rFonts w:ascii="Consolas" w:eastAsia="Consolas" w:hAnsi="Consolas" w:cs="Consolas"/>
-          <w:sz w:val="16"/>
-          <w:szCs w:val="16"/>
-        </w:rPr>
-        <w:t>activa reglas</w:t>
-      </w:r>
-      <w:proofErr w:type="gramEnd"/>
-      <w:r>
-        <w:rPr>
-          <w:rFonts w:ascii="Consolas" w:eastAsia="Consolas" w:hAnsi="Consolas" w:cs="Consolas"/>
-          <w:sz w:val="16"/>
-          <w:szCs w:val="16"/>
-        </w:rPr>
-        <w:t>'</w:t>
+        <w:t>THEN 'No Relevante activa reglas'</w:t>
       </w:r>
     </w:p>
     <w:p>
@@ -11372,12 +10795,6 @@
         <w:gridCol w:w="9600"/>
       </w:tblGrid>
       <w:tr>
-        <w:tblPrEx>
-          <w:tblCellMar>
-            <w:top w:w="0" w:type="dxa"/>
-            <w:bottom w:w="0" w:type="dxa"/>
-          </w:tblCellMar>
-        </w:tblPrEx>
         <w:tc>
           <w:tcPr>
             <w:tcW w:w="9360" w:type="dxa"/>
@@ -11408,7 +10825,6 @@
                 <w:sz w:val="18"/>
                 <w:szCs w:val="18"/>
               </w:rPr>
-              <w:lastRenderedPageBreak/>
               <w:drawing>
                 <wp:inline distT="0" distB="0" distL="0" distR="0" wp14:anchorId="40EFF57E" wp14:editId="50556151">
                   <wp:extent cx="5934075" cy="2609850"/>
@@ -11427,7 +10843,7 @@
                           </pic:cNvPicPr>
                         </pic:nvPicPr>
                         <pic:blipFill>
-                          <a:blip r:embed="rId14">
+                          <a:blip r:embed="rId17">
                             <a:extLst>
                               <a:ext uri="{28A0092B-C50C-407E-A947-70E740481C1C}">
                                 <a14:useLocalDpi xmlns:a14="http://schemas.microsoft.com/office/drawing/2010/main" val="0"/>
@@ -11482,10 +10898,7 @@
         <w:pStyle w:val="Ttulo2"/>
       </w:pPr>
       <w:r>
-        <w:t>2.5 Auditoría</w:t>
-      </w:r>
-      <w:r>
-        <w:t xml:space="preserve"> humana simulada</w:t>
+        <w:t>2.5 Auditoría humana simulada</w:t>
       </w:r>
     </w:p>
     <w:p>
@@ -11585,12 +10998,6 @@
         <w:gridCol w:w="3956"/>
       </w:tblGrid>
       <w:tr>
-        <w:tblPrEx>
-          <w:tblCellMar>
-            <w:top w:w="0" w:type="dxa"/>
-            <w:bottom w:w="0" w:type="dxa"/>
-          </w:tblCellMar>
-        </w:tblPrEx>
         <w:trPr>
           <w:tblHeader/>
         </w:trPr>
@@ -11720,12 +11127,6 @@
         </w:tc>
       </w:tr>
       <w:tr>
-        <w:tblPrEx>
-          <w:tblCellMar>
-            <w:top w:w="0" w:type="dxa"/>
-            <w:bottom w:w="0" w:type="dxa"/>
-          </w:tblCellMar>
-        </w:tblPrEx>
         <w:tc>
           <w:tcPr>
             <w:tcW w:w="2550" w:type="dxa"/>
@@ -11868,34 +11269,18 @@
             <w:vAlign w:val="center"/>
           </w:tcPr>
           <w:p>
-            <w:proofErr w:type="gramStart"/>
-            <w:r>
-              <w:rPr>
-                <w:color w:val="000000"/>
-                <w:sz w:val="18"/>
-                <w:szCs w:val="18"/>
-              </w:rPr>
-              <w:t>Activa reglas</w:t>
-            </w:r>
-            <w:proofErr w:type="gramEnd"/>
-            <w:r>
-              <w:rPr>
-                <w:color w:val="000000"/>
-                <w:sz w:val="18"/>
-                <w:szCs w:val="18"/>
-              </w:rPr>
-              <w:t xml:space="preserve"> (boleta, cumplimiento tributario) con evidencia coherente; explicación suficiente y trazable.</w:t>
+            <w:r>
+              <w:rPr>
+                <w:color w:val="000000"/>
+                <w:sz w:val="18"/>
+                <w:szCs w:val="18"/>
+              </w:rPr>
+              <w:t>Activa reglas (boleta, cumplimiento tributario) con evidencia coherente; explicación suficiente y trazable.</w:t>
             </w:r>
           </w:p>
         </w:tc>
       </w:tr>
       <w:tr>
-        <w:tblPrEx>
-          <w:tblCellMar>
-            <w:top w:w="0" w:type="dxa"/>
-            <w:bottom w:w="0" w:type="dxa"/>
-          </w:tblCellMar>
-        </w:tblPrEx>
         <w:tc>
           <w:tcPr>
             <w:tcW w:w="2550" w:type="dxa"/>
@@ -12050,12 +11435,6 @@
         </w:tc>
       </w:tr>
       <w:tr>
-        <w:tblPrEx>
-          <w:tblCellMar>
-            <w:top w:w="0" w:type="dxa"/>
-            <w:bottom w:w="0" w:type="dxa"/>
-          </w:tblCellMar>
-        </w:tblPrEx>
         <w:tc>
           <w:tcPr>
             <w:tcW w:w="2550" w:type="dxa"/>
@@ -12210,12 +11589,6 @@
         </w:tc>
       </w:tr>
       <w:tr>
-        <w:tblPrEx>
-          <w:tblCellMar>
-            <w:top w:w="0" w:type="dxa"/>
-            <w:bottom w:w="0" w:type="dxa"/>
-          </w:tblCellMar>
-        </w:tblPrEx>
         <w:tc>
           <w:tcPr>
             <w:tcW w:w="2550" w:type="dxa"/>
@@ -12370,12 +11743,6 @@
         </w:tc>
       </w:tr>
       <w:tr>
-        <w:tblPrEx>
-          <w:tblCellMar>
-            <w:top w:w="0" w:type="dxa"/>
-            <w:bottom w:w="0" w:type="dxa"/>
-          </w:tblCellMar>
-        </w:tblPrEx>
         <w:tc>
           <w:tcPr>
             <w:tcW w:w="2550" w:type="dxa"/>
@@ -12530,12 +11897,6 @@
         </w:tc>
       </w:tr>
       <w:tr>
-        <w:tblPrEx>
-          <w:tblCellMar>
-            <w:top w:w="0" w:type="dxa"/>
-            <w:bottom w:w="0" w:type="dxa"/>
-          </w:tblCellMar>
-        </w:tblPrEx>
         <w:tc>
           <w:tcPr>
             <w:tcW w:w="2550" w:type="dxa"/>
@@ -12708,12 +12069,6 @@
         </w:tc>
       </w:tr>
       <w:tr>
-        <w:tblPrEx>
-          <w:tblCellMar>
-            <w:top w:w="0" w:type="dxa"/>
-            <w:bottom w:w="0" w:type="dxa"/>
-          </w:tblCellMar>
-        </w:tblPrEx>
         <w:tc>
           <w:tcPr>
             <w:tcW w:w="9360" w:type="dxa"/>
@@ -12745,7 +12100,6 @@
                 <w:sz w:val="18"/>
                 <w:szCs w:val="18"/>
               </w:rPr>
-              <w:lastRenderedPageBreak/>
               <w:drawing>
                 <wp:inline distT="0" distB="0" distL="0" distR="0" wp14:anchorId="01F1669C" wp14:editId="18416510">
                   <wp:extent cx="5934075" cy="2590800"/>
@@ -12764,7 +12118,7 @@
                           </pic:cNvPicPr>
                         </pic:nvPicPr>
                         <pic:blipFill>
-                          <a:blip r:embed="rId15">
+                          <a:blip r:embed="rId18">
                             <a:extLst>
                               <a:ext uri="{28A0092B-C50C-407E-A947-70E740481C1C}">
                                 <a14:useLocalDpi xmlns:a14="http://schemas.microsoft.com/office/drawing/2010/main" val="0"/>
@@ -12840,7 +12194,13 @@
       <w:pPr>
         <w:pStyle w:val="Ttulo1"/>
       </w:pPr>
-      <w:r>
+    </w:p>
+    <w:p>
+      <w:pPr>
+        <w:pStyle w:val="Ttulo1"/>
+      </w:pPr>
+      <w:r>
+        <w:lastRenderedPageBreak/>
         <w:t>3.  Conclusiones</w:t>
       </w:r>
     </w:p>
@@ -12951,26 +12311,113 @@
       </w:r>
       <w:proofErr w:type="spellEnd"/>
       <w:r>
-        <w:t xml:space="preserve">), por lo que no captura sinonimia ni contexto semántico y puede generar falsos positivos —mitigados parcialmente con límites de palabra para tokens cortos como «POS»—. Una </w:t>
-      </w:r>
+        <w:t xml:space="preserve">), por lo que no captura sinonimia ni contexto semántico y puede generar falsos positivos —mitigados parcialmente con límites de palabra para tokens cortos como «POS»—. Una extensión natural sería incorporar </w:t>
+      </w:r>
+      <w:proofErr w:type="spellStart"/>
+      <w:r>
+        <w:t>embeddings</w:t>
+      </w:r>
+      <w:proofErr w:type="spellEnd"/>
+      <w:r>
+        <w:t xml:space="preserve"> o búsqueda semántica para complementar las reglas léxicas, y enriquecer la evidencia textual con el fragmento exacto que rodea cada coincidencia.</w:t>
+      </w:r>
+    </w:p>
+    <w:p>
+      <w:pPr>
+        <w:spacing w:after="60" w:line="276" w:lineRule="auto"/>
+        <w:jc w:val="both"/>
+      </w:pPr>
+    </w:p>
+    <w:p>
+      <w:pPr>
+        <w:spacing w:after="60" w:line="276" w:lineRule="auto"/>
+        <w:jc w:val="both"/>
+      </w:pPr>
+    </w:p>
+    <w:p>
+      <w:pPr>
+        <w:spacing w:after="60" w:line="276" w:lineRule="auto"/>
+        <w:jc w:val="both"/>
+      </w:pPr>
+    </w:p>
+    <w:p>
+      <w:pPr>
+        <w:spacing w:after="60" w:line="276" w:lineRule="auto"/>
+        <w:jc w:val="both"/>
+      </w:pPr>
+    </w:p>
+    <w:p>
+      <w:pPr>
+        <w:spacing w:after="60" w:line="276" w:lineRule="auto"/>
+        <w:jc w:val="both"/>
+      </w:pPr>
+    </w:p>
+    <w:p>
+      <w:pPr>
+        <w:spacing w:after="60" w:line="276" w:lineRule="auto"/>
+        <w:jc w:val="both"/>
+      </w:pPr>
+    </w:p>
+    <w:p>
+      <w:pPr>
+        <w:spacing w:after="60" w:line="276" w:lineRule="auto"/>
+        <w:jc w:val="both"/>
+      </w:pPr>
+    </w:p>
+    <w:p>
+      <w:pPr>
+        <w:spacing w:after="60" w:line="276" w:lineRule="auto"/>
+        <w:jc w:val="both"/>
+      </w:pPr>
+    </w:p>
+    <w:p>
+      <w:pPr>
+        <w:spacing w:after="60" w:line="276" w:lineRule="auto"/>
+        <w:jc w:val="both"/>
+      </w:pPr>
+    </w:p>
+    <w:p>
+      <w:pPr>
+        <w:spacing w:after="60" w:line="276" w:lineRule="auto"/>
+        <w:jc w:val="both"/>
+      </w:pPr>
+    </w:p>
+    <w:p>
+      <w:pPr>
+        <w:spacing w:after="60" w:line="276" w:lineRule="auto"/>
+        <w:jc w:val="both"/>
+      </w:pPr>
+    </w:p>
+    <w:p>
+      <w:pPr>
+        <w:spacing w:after="60" w:line="276" w:lineRule="auto"/>
+        <w:jc w:val="both"/>
+      </w:pPr>
+    </w:p>
+    <w:p>
+      <w:pPr>
+        <w:spacing w:after="60" w:line="276" w:lineRule="auto"/>
+        <w:jc w:val="both"/>
+      </w:pPr>
+    </w:p>
+    <w:p>
+      <w:pPr>
+        <w:spacing w:after="60" w:line="276" w:lineRule="auto"/>
+        <w:jc w:val="both"/>
+      </w:pPr>
+    </w:p>
+    <w:p>
+      <w:pPr>
+        <w:spacing w:after="60" w:line="276" w:lineRule="auto"/>
+        <w:jc w:val="both"/>
+      </w:pPr>
+    </w:p>
+    <w:p>
+      <w:pPr>
+        <w:pStyle w:val="Ttulo1"/>
+      </w:pPr>
       <w:r>
         <w:lastRenderedPageBreak/>
-        <w:t xml:space="preserve">extensión natural sería incorporar </w:t>
-      </w:r>
-      <w:proofErr w:type="spellStart"/>
-      <w:r>
-        <w:t>embeddings</w:t>
-      </w:r>
-      <w:proofErr w:type="spellEnd"/>
-      <w:r>
-        <w:t xml:space="preserve"> o búsqueda semántica para complementar las reglas léxicas, y enriquecer la evidencia textual con el fragmento exacto que rodea cada coincidencia.</w:t>
-      </w:r>
-    </w:p>
-    <w:p>
-      <w:pPr>
-        <w:pStyle w:val="Ttulo1"/>
-      </w:pPr>
-      <w:r>
         <w:t>4.  Referencias Bibliográficas</w:t>
       </w:r>
     </w:p>
@@ -12985,7 +12432,13 @@
         <w:jc w:val="both"/>
       </w:pPr>
       <w:r>
-        <w:t xml:space="preserve">Arrieta, A. B., et al. (2020). </w:t>
+        <w:t xml:space="preserve">Arrieta, A. B., et al. </w:t>
+      </w:r>
+      <w:r>
+        <w:rPr>
+          <w:lang w:val="en-US"/>
+        </w:rPr>
+        <w:t xml:space="preserve">(2020). </w:t>
       </w:r>
       <w:r>
         <w:rPr>
@@ -13043,6 +12496,9 @@
         </w:rPr>
       </w:pPr>
       <w:r>
+        <w:rPr>
+          <w:lang w:val="en-US"/>
+        </w:rPr>
         <w:t xml:space="preserve">Neo4j. (s. f.). </w:t>
       </w:r>
       <w:r>
@@ -13074,6 +12530,9 @@
         </w:rPr>
       </w:pPr>
       <w:r>
+        <w:rPr>
+          <w:lang w:val="en-US"/>
+        </w:rPr>
         <w:t xml:space="preserve">Neo4j. (s. f.). </w:t>
       </w:r>
       <w:r>
@@ -13222,7 +12681,7 @@
       </w:r>
     </w:p>
     <w:sectPr>
-      <w:footerReference w:type="default" r:id="rId16"/>
+      <w:footerReference w:type="default" r:id="rId19"/>
       <w:pgSz w:w="12240" w:h="15840"/>
       <w:pgMar w:top="1440" w:right="1440" w:bottom="1440" w:left="1440" w:header="708" w:footer="708" w:gutter="0"/>
       <w:cols w:space="720"/>
@@ -14205,6 +13664,18 @@
       <w:szCs w:val="20"/>
     </w:rPr>
   </w:style>
+  <w:style w:type="character" w:styleId="Mencinsinresolver">
+    <w:name w:val="Unresolved Mention"/>
+    <w:basedOn w:val="Fuentedeprrafopredeter"/>
+    <w:uiPriority w:val="99"/>
+    <w:semiHidden/>
+    <w:unhideWhenUsed/>
+    <w:rsid w:val="00DB55D2"/>
+    <w:rPr>
+      <w:color w:val="605E5C"/>
+      <w:shd w:val="clear" w:color="auto" w:fill="E1DFDD"/>
+    </w:rPr>
+  </w:style>
 </w:styles>
 </file>
 

</xml_diff>